<commit_message>
docs: added title page, page numbers, and planned out main headings
</commit_message>
<xml_diff>
--- a/Documents/Report (Number_Guessing_Game).docx
+++ b/Documents/Report (Number_Guessing_Game).docx
@@ -2,69 +2,1401 @@
 <file path=word/document.xml><?xml version="1.0" encoding="utf-8"?>
 <w:document xmlns:wpc="http://schemas.microsoft.com/office/word/2010/wordprocessingCanvas" xmlns:cx="http://schemas.microsoft.com/office/drawing/2014/chartex" xmlns:cx1="http://schemas.microsoft.com/office/drawing/2015/9/8/chartex" xmlns:cx2="http://schemas.microsoft.com/office/drawing/2015/10/21/chartex" xmlns:cx3="http://schemas.microsoft.com/office/drawing/2016/5/9/chartex" xmlns:cx4="http://schemas.microsoft.com/office/drawing/2016/5/10/chartex" xmlns:cx5="http://schemas.microsoft.com/office/drawing/2016/5/11/chartex" xmlns:cx6="http://schemas.microsoft.com/office/drawing/2016/5/12/chartex" xmlns:cx7="http://schemas.microsoft.com/office/drawing/2016/5/13/chartex" xmlns:cx8="http://schemas.microsoft.com/office/drawing/2016/5/14/chartex" xmlns:mc="http://schemas.openxmlformats.org/markup-compatibility/2006" xmlns:aink="http://schemas.microsoft.com/office/drawing/2016/ink" xmlns:am3d="http://schemas.microsoft.com/office/drawing/2017/model3d" xmlns:o="urn:schemas-microsoft-com:office:office" xmlns:oel="http://schemas.microsoft.com/office/2019/extlst" xmlns:r="http://schemas.openxmlformats.org/officeDocument/2006/relationships" xmlns:m="http://schemas.openxmlformats.org/officeDocument/2006/math" xmlns:v="urn:schemas-microsoft-com:vml" xmlns:wp14="http://schemas.microsoft.com/office/word/2010/wordprocessingDrawing" xmlns:wp="http://schemas.openxmlformats.org/drawingml/2006/wordprocessingDrawing" xmlns:w10="urn:schemas-microsoft-com:office:word" xmlns:w="http://schemas.openxmlformats.org/wordprocessingml/2006/main" xmlns:w14="http://schemas.microsoft.com/office/word/2010/wordml" xmlns:w15="http://schemas.microsoft.com/office/word/2012/wordml" xmlns:w16cex="http://schemas.microsoft.com/office/word/2018/wordml/cex" xmlns:w16cid="http://schemas.microsoft.com/office/word/2016/wordml/cid" xmlns:w16="http://schemas.microsoft.com/office/word/2018/wordml" xmlns:w16du="http://schemas.microsoft.com/office/word/2023/wordml/word16du" xmlns:w16sdtdh="http://schemas.microsoft.com/office/word/2020/wordml/sdtdatahash" xmlns:w16sdtfl="http://schemas.microsoft.com/office/word/2024/wordml/sdtformatlock" xmlns:w16se="http://schemas.microsoft.com/office/word/2015/wordml/symex" xmlns:wpg="http://schemas.microsoft.com/office/word/2010/wordprocessingGroup" xmlns:wpi="http://schemas.microsoft.com/office/word/2010/wordprocessingInk" xmlns:wne="http://schemas.microsoft.com/office/word/2006/wordml" xmlns:wps="http://schemas.microsoft.com/office/word/2010/wordprocessingShape" mc:Ignorable="w14 w15 w16se w16cid w16 w16cex w16sdtdh w16sdtfl w16du wp14">
   <w:body>
-    <w:p>
-      <w:pPr>
-        <w:pStyle w:val="Title"/>
-      </w:pPr>
-    </w:p>
-    <w:p>
-      <w:pPr>
-        <w:pStyle w:val="Title"/>
-      </w:pPr>
-    </w:p>
-    <w:p>
-      <w:pPr>
-        <w:pStyle w:val="Title"/>
-      </w:pPr>
-    </w:p>
-    <w:p>
-      <w:pPr>
-        <w:pStyle w:val="Title"/>
-      </w:pPr>
-    </w:p>
-    <w:p>
-      <w:pPr>
-        <w:pStyle w:val="Title"/>
-      </w:pPr>
-    </w:p>
-    <w:p>
-      <w:pPr>
-        <w:pStyle w:val="Title"/>
-        <w:jc w:val="center"/>
-      </w:pPr>
-      <w:r>
-        <w:t>Number Guessing Game</w:t>
-      </w:r>
-    </w:p>
-    <w:p>
-      <w:pPr>
-        <w:pStyle w:val="Subtitle"/>
-        <w:jc w:val="center"/>
-      </w:pPr>
-      <w:r>
-        <w:t xml:space="preserve">A </w:t>
-      </w:r>
-      <w:r>
-        <w:t>Portfolio</w:t>
-      </w:r>
-      <w:r>
-        <w:t xml:space="preserve"> Project</w:t>
-      </w:r>
-    </w:p>
-    <w:p>
-      <w:pPr>
-        <w:jc w:val="center"/>
+    <w:sdt>
+      <w:sdtPr>
+        <w:id w:val="1034613245"/>
+        <w:docPartObj>
+          <w:docPartGallery w:val="Cover Pages"/>
+          <w:docPartUnique/>
+        </w:docPartObj>
+      </w:sdtPr>
+      <w:sdtContent>
+        <w:p>
+          <w:r>
+            <w:rPr>
+              <w:noProof/>
+            </w:rPr>
+            <mc:AlternateContent>
+              <mc:Choice Requires="wps">
+                <w:drawing>
+                  <wp:anchor distT="0" distB="0" distL="114300" distR="114300" simplePos="0" relativeHeight="251664384" behindDoc="0" locked="0" layoutInCell="1" allowOverlap="1" wp14:anchorId="1C79C047" wp14:editId="05D229DB">
+                    <wp:simplePos x="0" y="0"/>
+                    <mc:AlternateContent>
+                      <mc:Choice Requires="wp14">
+                        <wp:positionH relativeFrom="page">
+                          <wp14:pctPosHOffset>45500</wp14:pctPosHOffset>
+                        </wp:positionH>
+                      </mc:Choice>
+                      <mc:Fallback>
+                        <wp:positionH relativeFrom="page">
+                          <wp:posOffset>3439795</wp:posOffset>
+                        </wp:positionH>
+                      </mc:Fallback>
+                    </mc:AlternateContent>
+                    <mc:AlternateContent>
+                      <mc:Choice Requires="wp14">
+                        <wp:positionV relativeFrom="page">
+                          <wp14:pctPosVOffset>66000</wp14:pctPosVOffset>
+                        </wp:positionV>
+                      </mc:Choice>
+                      <mc:Fallback>
+                        <wp:positionV relativeFrom="page">
+                          <wp:posOffset>7056755</wp:posOffset>
+                        </wp:positionV>
+                      </mc:Fallback>
+                    </mc:AlternateContent>
+                    <wp:extent cx="2797810" cy="268605"/>
+                    <wp:effectExtent l="0" t="0" r="0" b="0"/>
+                    <wp:wrapSquare wrapText="bothSides"/>
+                    <wp:docPr id="465" name="Text Box 255"/>
+                    <wp:cNvGraphicFramePr/>
+                    <a:graphic xmlns:a="http://schemas.openxmlformats.org/drawingml/2006/main">
+                      <a:graphicData uri="http://schemas.microsoft.com/office/word/2010/wordprocessingShape">
+                        <wps:wsp>
+                          <wps:cNvSpPr txBox="1"/>
+                          <wps:spPr>
+                            <a:xfrm>
+                              <a:off x="0" y="0"/>
+                              <a:ext cx="2797810" cy="268605"/>
+                            </a:xfrm>
+                            <a:prstGeom prst="rect">
+                              <a:avLst/>
+                            </a:prstGeom>
+                            <a:noFill/>
+                            <a:ln w="6350">
+                              <a:noFill/>
+                            </a:ln>
+                            <a:effectLst/>
+                          </wps:spPr>
+                          <wps:txbx>
+                            <w:txbxContent>
+                              <w:p>
+                                <w:pPr>
+                                  <w:pStyle w:val="NoSpacing"/>
+                                  <w:rPr>
+                                    <w:noProof/>
+                                    <w:color w:val="454551" w:themeColor="text2"/>
+                                  </w:rPr>
+                                </w:pPr>
+                                <w:sdt>
+                                  <w:sdtPr>
+                                    <w:rPr>
+                                      <w:noProof/>
+                                      <w:color w:val="454551" w:themeColor="text2"/>
+                                    </w:rPr>
+                                    <w:alias w:val="Author"/>
+                                    <w:id w:val="15524260"/>
+                                    <w:dataBinding w:prefixMappings="xmlns:ns0='http://schemas.openxmlformats.org/package/2006/metadata/core-properties' xmlns:ns1='http://purl.org/dc/elements/1.1/'" w:xpath="/ns0:coreProperties[1]/ns1:creator[1]" w:storeItemID="{6C3C8BC8-F283-45AE-878A-BAB7291924A1}"/>
+                                    <w:text/>
+                                  </w:sdtPr>
+                                  <w:sdtContent>
+                                    <w:r>
+                                      <w:rPr>
+                                        <w:noProof/>
+                                        <w:color w:val="454551" w:themeColor="text2"/>
+                                      </w:rPr>
+                                      <w:t>Danciu, Alexandra (2025)</w:t>
+                                    </w:r>
+                                  </w:sdtContent>
+                                </w:sdt>
+                              </w:p>
+                            </w:txbxContent>
+                          </wps:txbx>
+                          <wps:bodyPr rot="0" spcFirstLastPara="0" vertOverflow="overflow" horzOverflow="overflow" vert="horz" wrap="square" lIns="91440" tIns="45720" rIns="91440" bIns="45720" numCol="1" spcCol="0" rtlCol="0" fromWordArt="0" anchor="b" anchorCtr="0" forceAA="0" compatLnSpc="1">
+                            <a:prstTxWarp prst="textNoShape">
+                              <a:avLst/>
+                            </a:prstTxWarp>
+                            <a:spAutoFit/>
+                          </wps:bodyPr>
+                        </wps:wsp>
+                      </a:graphicData>
+                    </a:graphic>
+                    <wp14:sizeRelH relativeFrom="page">
+                      <wp14:pctWidth>36000</wp14:pctWidth>
+                    </wp14:sizeRelH>
+                    <wp14:sizeRelV relativeFrom="margin">
+                      <wp14:pctHeight>0</wp14:pctHeight>
+                    </wp14:sizeRelV>
+                  </wp:anchor>
+                </w:drawing>
+              </mc:Choice>
+              <mc:Fallback>
+                <w:pict>
+                  <v:shapetype w14:anchorId="1C79C047" id="_x0000_t202" coordsize="21600,21600" o:spt="202" path="m,l,21600r21600,l21600,xe">
+                    <v:stroke joinstyle="miter"/>
+                    <v:path gradientshapeok="t" o:connecttype="rect"/>
+                  </v:shapetype>
+                  <v:shape id="Text Box 255" o:spid="_x0000_s1026" type="#_x0000_t202" style="position:absolute;margin-left:0;margin-top:0;width:220.3pt;height:21.15pt;z-index:251664384;visibility:visible;mso-wrap-style:square;mso-width-percent:360;mso-height-percent:0;mso-left-percent:455;mso-top-percent:660;mso-wrap-distance-left:9pt;mso-wrap-distance-top:0;mso-wrap-distance-right:9pt;mso-wrap-distance-bottom:0;mso-position-horizontal-relative:page;mso-position-vertical-relative:page;mso-width-percent:360;mso-height-percent:0;mso-left-percent:455;mso-top-percent:660;mso-width-relative:page;mso-height-relative:margin;v-text-anchor:bottom" o:gfxdata="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" filled="f" stroked="f" strokeweight=".5pt">
+                    <v:textbox style="mso-fit-shape-to-text:t">
+                      <w:txbxContent>
+                        <w:p>
+                          <w:pPr>
+                            <w:pStyle w:val="NoSpacing"/>
+                            <w:rPr>
+                              <w:noProof/>
+                              <w:color w:val="454551" w:themeColor="text2"/>
+                            </w:rPr>
+                          </w:pPr>
+                          <w:sdt>
+                            <w:sdtPr>
+                              <w:rPr>
+                                <w:noProof/>
+                                <w:color w:val="454551" w:themeColor="text2"/>
+                              </w:rPr>
+                              <w:alias w:val="Author"/>
+                              <w:id w:val="15524260"/>
+                              <w:dataBinding w:prefixMappings="xmlns:ns0='http://schemas.openxmlformats.org/package/2006/metadata/core-properties' xmlns:ns1='http://purl.org/dc/elements/1.1/'" w:xpath="/ns0:coreProperties[1]/ns1:creator[1]" w:storeItemID="{6C3C8BC8-F283-45AE-878A-BAB7291924A1}"/>
+                              <w:text/>
+                            </w:sdtPr>
+                            <w:sdtContent>
+                              <w:r>
+                                <w:rPr>
+                                  <w:noProof/>
+                                  <w:color w:val="454551" w:themeColor="text2"/>
+                                </w:rPr>
+                                <w:t>Danciu, Alexandra (2025)</w:t>
+                              </w:r>
+                            </w:sdtContent>
+                          </w:sdt>
+                        </w:p>
+                      </w:txbxContent>
+                    </v:textbox>
+                    <w10:wrap type="square" anchorx="page" anchory="page"/>
+                  </v:shape>
+                </w:pict>
+              </mc:Fallback>
+            </mc:AlternateContent>
+          </w:r>
+          <w:r>
+            <w:rPr>
+              <w:noProof/>
+            </w:rPr>
+            <mc:AlternateContent>
+              <mc:Choice Requires="wps">
+                <w:drawing>
+                  <wp:anchor distT="0" distB="0" distL="114300" distR="114300" simplePos="0" relativeHeight="251663360" behindDoc="1" locked="0" layoutInCell="1" allowOverlap="1" wp14:anchorId="6A9C63AA" wp14:editId="0CA857F0">
+                    <wp:simplePos x="0" y="0"/>
+                    <wp:positionH relativeFrom="page">
+                      <wp:align>center</wp:align>
+                    </wp:positionH>
+                    <wp:positionV relativeFrom="page">
+                      <wp:align>center</wp:align>
+                    </wp:positionV>
+                    <wp:extent cx="7383780" cy="9555480"/>
+                    <wp:effectExtent l="0" t="0" r="7620" b="7620"/>
+                    <wp:wrapNone/>
+                    <wp:docPr id="466" name="Rectangle 257"/>
+                    <wp:cNvGraphicFramePr>
+                      <a:graphicFrameLocks xmlns:a="http://schemas.openxmlformats.org/drawingml/2006/main"/>
+                    </wp:cNvGraphicFramePr>
+                    <a:graphic xmlns:a="http://schemas.openxmlformats.org/drawingml/2006/main">
+                      <a:graphicData uri="http://schemas.microsoft.com/office/word/2010/wordprocessingShape">
+                        <wps:wsp>
+                          <wps:cNvSpPr>
+                            <a:spLocks/>
+                          </wps:cNvSpPr>
+                          <wps:spPr>
+                            <a:xfrm>
+                              <a:off x="0" y="0"/>
+                              <a:ext cx="7383780" cy="9555480"/>
+                            </a:xfrm>
+                            <a:prstGeom prst="rect">
+                              <a:avLst/>
+                            </a:prstGeom>
+                            <a:gradFill>
+                              <a:gsLst>
+                                <a:gs pos="0">
+                                  <a:schemeClr val="accent1">
+                                    <a:lumMod val="20000"/>
+                                    <a:lumOff val="80000"/>
+                                  </a:schemeClr>
+                                </a:gs>
+                                <a:gs pos="100000">
+                                  <a:schemeClr val="accent1">
+                                    <a:lumMod val="60000"/>
+                                    <a:lumOff val="40000"/>
+                                  </a:schemeClr>
+                                </a:gs>
+                              </a:gsLst>
+                            </a:gradFill>
+                            <a:ln>
+                              <a:noFill/>
+                            </a:ln>
+                          </wps:spPr>
+                          <wps:style>
+                            <a:lnRef idx="2">
+                              <a:schemeClr val="accent1">
+                                <a:shade val="50000"/>
+                              </a:schemeClr>
+                            </a:lnRef>
+                            <a:fillRef idx="1003">
+                              <a:schemeClr val="lt2"/>
+                            </a:fillRef>
+                            <a:effectRef idx="0">
+                              <a:schemeClr val="accent1"/>
+                            </a:effectRef>
+                            <a:fontRef idx="minor">
+                              <a:schemeClr val="lt1"/>
+                            </a:fontRef>
+                          </wps:style>
+                          <wps:txbx>
+                            <w:txbxContent>
+                              <w:p/>
+                            </w:txbxContent>
+                          </wps:txbx>
+                          <wps:bodyPr rot="0" spcFirstLastPara="0" vertOverflow="overflow" horzOverflow="overflow" vert="horz" wrap="square" lIns="274320" tIns="45720" rIns="274320" bIns="45720" numCol="1" spcCol="0" rtlCol="0" fromWordArt="0" anchor="ctr" anchorCtr="0" forceAA="0" compatLnSpc="1">
+                            <a:prstTxWarp prst="textNoShape">
+                              <a:avLst/>
+                            </a:prstTxWarp>
+                            <a:noAutofit/>
+                          </wps:bodyPr>
+                        </wps:wsp>
+                      </a:graphicData>
+                    </a:graphic>
+                    <wp14:sizeRelH relativeFrom="page">
+                      <wp14:pctWidth>95000</wp14:pctWidth>
+                    </wp14:sizeRelH>
+                    <wp14:sizeRelV relativeFrom="page">
+                      <wp14:pctHeight>95000</wp14:pctHeight>
+                    </wp14:sizeRelV>
+                  </wp:anchor>
+                </w:drawing>
+              </mc:Choice>
+              <mc:Fallback>
+                <w:pict>
+                  <v:rect w14:anchorId="6A9C63AA" id="Rectangle 257" o:spid="_x0000_s1027" style="position:absolute;margin-left:0;margin-top:0;width:581.4pt;height:752.4pt;z-index:-251653120;visibility:visible;mso-wrap-style:square;mso-width-percent:950;mso-height-percent:950;mso-wrap-distance-left:9pt;mso-wrap-distance-top:0;mso-wrap-distance-right:9pt;mso-wrap-distance-bottom:0;mso-position-horizontal:center;mso-position-horizontal-relative:page;mso-position-vertical:center;mso-position-vertical-relative:page;mso-width-percent:950;mso-height-percent:950;mso-width-relative:page;mso-height-relative:page;v-text-anchor:middle" o:gfxdata="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" fillcolor="#f9d4e8 [660]" stroked="f" strokeweight="1.5pt">
+                    <v:fill color2="#ee80bc [1940]" rotate="t" focus="100%" type="gradient">
+                      <o:fill v:ext="view" type="gradientUnscaled"/>
+                    </v:fill>
+                    <v:textbox inset="21.6pt,,21.6pt">
+                      <w:txbxContent>
+                        <w:p/>
+                      </w:txbxContent>
+                    </v:textbox>
+                    <w10:wrap anchorx="page" anchory="page"/>
+                  </v:rect>
+                </w:pict>
+              </mc:Fallback>
+            </mc:AlternateContent>
+          </w:r>
+          <w:r>
+            <w:rPr>
+              <w:noProof/>
+            </w:rPr>
+            <mc:AlternateContent>
+              <mc:Choice Requires="wps">
+                <w:drawing>
+                  <wp:anchor distT="0" distB="0" distL="114300" distR="114300" simplePos="0" relativeHeight="251660288" behindDoc="0" locked="0" layoutInCell="1" allowOverlap="1" wp14:anchorId="31424A3C" wp14:editId="3B53FD12">
+                    <wp:simplePos x="0" y="0"/>
+                    <mc:AlternateContent>
+                      <mc:Choice Requires="wp14">
+                        <wp:positionH relativeFrom="page">
+                          <wp14:pctPosHOffset>45500</wp14:pctPosHOffset>
+                        </wp:positionH>
+                      </mc:Choice>
+                      <mc:Fallback>
+                        <wp:positionH relativeFrom="page">
+                          <wp:posOffset>3439795</wp:posOffset>
+                        </wp:positionH>
+                      </mc:Fallback>
+                    </mc:AlternateContent>
+                    <mc:AlternateContent>
+                      <mc:Choice Requires="wp14">
+                        <wp:positionV relativeFrom="page">
+                          <wp14:pctPosVOffset>2500</wp14:pctPosVOffset>
+                        </wp:positionV>
+                      </mc:Choice>
+                      <mc:Fallback>
+                        <wp:positionV relativeFrom="page">
+                          <wp:posOffset>266700</wp:posOffset>
+                        </wp:positionV>
+                      </mc:Fallback>
+                    </mc:AlternateContent>
+                    <wp:extent cx="2875915" cy="3017520"/>
+                    <wp:effectExtent l="0" t="0" r="3175" b="0"/>
+                    <wp:wrapNone/>
+                    <wp:docPr id="467" name="Rectangle 259"/>
+                    <wp:cNvGraphicFramePr/>
+                    <a:graphic xmlns:a="http://schemas.openxmlformats.org/drawingml/2006/main">
+                      <a:graphicData uri="http://schemas.microsoft.com/office/word/2010/wordprocessingShape">
+                        <wps:wsp>
+                          <wps:cNvSpPr/>
+                          <wps:spPr>
+                            <a:xfrm>
+                              <a:off x="0" y="0"/>
+                              <a:ext cx="2875915" cy="3017520"/>
+                            </a:xfrm>
+                            <a:prstGeom prst="rect">
+                              <a:avLst/>
+                            </a:prstGeom>
+                            <a:solidFill>
+                              <a:schemeClr val="accent1">
+                                <a:lumMod val="40000"/>
+                                <a:lumOff val="60000"/>
+                              </a:schemeClr>
+                            </a:solidFill>
+                            <a:ln>
+                              <a:noFill/>
+                            </a:ln>
+                          </wps:spPr>
+                          <wps:style>
+                            <a:lnRef idx="2">
+                              <a:schemeClr val="accent1">
+                                <a:shade val="50000"/>
+                              </a:schemeClr>
+                            </a:lnRef>
+                            <a:fillRef idx="1">
+                              <a:schemeClr val="accent1"/>
+                            </a:fillRef>
+                            <a:effectRef idx="0">
+                              <a:schemeClr val="accent1"/>
+                            </a:effectRef>
+                            <a:fontRef idx="minor">
+                              <a:schemeClr val="lt1"/>
+                            </a:fontRef>
+                          </wps:style>
+                          <wps:txbx>
+                            <w:txbxContent>
+                              <w:p>
+                                <w:pPr>
+                                  <w:spacing w:before="240"/>
+                                  <w:jc w:val="center"/>
+                                  <w:rPr>
+                                    <w:color w:val="FFFFFF" w:themeColor="background1"/>
+                                  </w:rPr>
+                                </w:pPr>
+                              </w:p>
+                            </w:txbxContent>
+                          </wps:txbx>
+                          <wps:bodyPr rot="0" spcFirstLastPara="0" vertOverflow="overflow" horzOverflow="overflow" vert="horz" wrap="square" lIns="182880" tIns="182880" rIns="182880" bIns="365760" numCol="1" spcCol="0" rtlCol="0" fromWordArt="0" anchor="b" anchorCtr="0" forceAA="0" compatLnSpc="1">
+                            <a:prstTxWarp prst="textNoShape">
+                              <a:avLst/>
+                            </a:prstTxWarp>
+                            <a:noAutofit/>
+                          </wps:bodyPr>
+                        </wps:wsp>
+                      </a:graphicData>
+                    </a:graphic>
+                    <wp14:sizeRelH relativeFrom="page">
+                      <wp14:pctWidth>37000</wp14:pctWidth>
+                    </wp14:sizeRelH>
+                    <wp14:sizeRelV relativeFrom="page">
+                      <wp14:pctHeight>30000</wp14:pctHeight>
+                    </wp14:sizeRelV>
+                  </wp:anchor>
+                </w:drawing>
+              </mc:Choice>
+              <mc:Fallback>
+                <w:pict>
+                  <v:rect w14:anchorId="31424A3C" id="Rectangle 259" o:spid="_x0000_s1028" style="position:absolute;margin-left:0;margin-top:0;width:226.45pt;height:237.6pt;z-index:251660288;visibility:visible;mso-wrap-style:square;mso-width-percent:370;mso-height-percent:300;mso-left-percent:455;mso-top-percent:25;mso-wrap-distance-left:9pt;mso-wrap-distance-top:0;mso-wrap-distance-right:9pt;mso-wrap-distance-bottom:0;mso-position-horizontal-relative:page;mso-position-vertical-relative:page;mso-width-percent:370;mso-height-percent:300;mso-left-percent:455;mso-top-percent:25;mso-width-relative:page;mso-height-relative:page;v-text-anchor:bottom" o:gfxdata="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" fillcolor="#f3aad2 [1300]" stroked="f" strokeweight="1.5pt">
+                    <v:textbox inset="14.4pt,14.4pt,14.4pt,28.8pt">
+                      <w:txbxContent>
+                        <w:p>
+                          <w:pPr>
+                            <w:spacing w:before="240"/>
+                            <w:jc w:val="center"/>
+                            <w:rPr>
+                              <w:color w:val="FFFFFF" w:themeColor="background1"/>
+                            </w:rPr>
+                          </w:pPr>
+                        </w:p>
+                      </w:txbxContent>
+                    </v:textbox>
+                    <w10:wrap anchorx="page" anchory="page"/>
+                  </v:rect>
+                </w:pict>
+              </mc:Fallback>
+            </mc:AlternateContent>
+          </w:r>
+          <w:r>
+            <w:rPr>
+              <w:noProof/>
+            </w:rPr>
+            <mc:AlternateContent>
+              <mc:Choice Requires="wps">
+                <w:drawing>
+                  <wp:anchor distT="0" distB="0" distL="114300" distR="114300" simplePos="0" relativeHeight="251659264" behindDoc="0" locked="0" layoutInCell="1" allowOverlap="1" wp14:anchorId="02E8FCAF" wp14:editId="3F32844A">
+                    <wp:simplePos x="0" y="0"/>
+                    <mc:AlternateContent>
+                      <mc:Choice Requires="wp14">
+                        <wp:positionH relativeFrom="page">
+                          <wp14:pctPosHOffset>44000</wp14:pctPosHOffset>
+                        </wp:positionH>
+                      </mc:Choice>
+                      <mc:Fallback>
+                        <wp:positionH relativeFrom="page">
+                          <wp:posOffset>3326130</wp:posOffset>
+                        </wp:positionH>
+                      </mc:Fallback>
+                    </mc:AlternateContent>
+                    <mc:AlternateContent>
+                      <mc:Choice Requires="wp14">
+                        <wp:positionV relativeFrom="page">
+                          <wp14:pctPosVOffset>2500</wp14:pctPosVOffset>
+                        </wp:positionV>
+                      </mc:Choice>
+                      <mc:Fallback>
+                        <wp:positionV relativeFrom="page">
+                          <wp:posOffset>266700</wp:posOffset>
+                        </wp:positionV>
+                      </mc:Fallback>
+                    </mc:AlternateContent>
+                    <wp:extent cx="3108960" cy="7040880"/>
+                    <wp:effectExtent l="0" t="0" r="0" b="0"/>
+                    <wp:wrapNone/>
+                    <wp:docPr id="468" name="Rectangle 261"/>
+                    <wp:cNvGraphicFramePr/>
+                    <a:graphic xmlns:a="http://schemas.openxmlformats.org/drawingml/2006/main">
+                      <a:graphicData uri="http://schemas.microsoft.com/office/word/2010/wordprocessingShape">
+                        <wps:wsp>
+                          <wps:cNvSpPr/>
+                          <wps:spPr>
+                            <a:xfrm>
+                              <a:off x="0" y="0"/>
+                              <a:ext cx="3108960" cy="7040880"/>
+                            </a:xfrm>
+                            <a:prstGeom prst="rect">
+                              <a:avLst/>
+                            </a:prstGeom>
+                            <a:solidFill>
+                              <a:schemeClr val="bg1"/>
+                            </a:solidFill>
+                            <a:ln w="15875">
+                              <a:solidFill>
+                                <a:schemeClr val="bg2">
+                                  <a:lumMod val="50000"/>
+                                </a:schemeClr>
+                              </a:solidFill>
+                            </a:ln>
+                          </wps:spPr>
+                          <wps:style>
+                            <a:lnRef idx="2">
+                              <a:schemeClr val="accent1">
+                                <a:shade val="50000"/>
+                              </a:schemeClr>
+                            </a:lnRef>
+                            <a:fillRef idx="1">
+                              <a:schemeClr val="accent1"/>
+                            </a:fillRef>
+                            <a:effectRef idx="0">
+                              <a:schemeClr val="accent1"/>
+                            </a:effectRef>
+                            <a:fontRef idx="minor">
+                              <a:schemeClr val="lt1"/>
+                            </a:fontRef>
+                          </wps:style>
+                          <wps:bodyPr rot="0" spcFirstLastPara="0" vertOverflow="overflow" horzOverflow="overflow" vert="horz" wrap="square" lIns="91440" tIns="45720" rIns="91440" bIns="45720" numCol="1" spcCol="0" rtlCol="0" fromWordArt="0" anchor="ctr" anchorCtr="0" forceAA="0" compatLnSpc="1">
+                            <a:prstTxWarp prst="textNoShape">
+                              <a:avLst/>
+                            </a:prstTxWarp>
+                            <a:noAutofit/>
+                          </wps:bodyPr>
+                        </wps:wsp>
+                      </a:graphicData>
+                    </a:graphic>
+                    <wp14:sizeRelH relativeFrom="page">
+                      <wp14:pctWidth>40000</wp14:pctWidth>
+                    </wp14:sizeRelH>
+                    <wp14:sizeRelV relativeFrom="page">
+                      <wp14:pctHeight>70000</wp14:pctHeight>
+                    </wp14:sizeRelV>
+                  </wp:anchor>
+                </w:drawing>
+              </mc:Choice>
+              <mc:Fallback>
+                <w:pict>
+                  <v:rect w14:anchorId="3AE94A4A" id="Rectangle 261" o:spid="_x0000_s1026" style="position:absolute;margin-left:0;margin-top:0;width:244.8pt;height:554.4pt;z-index:251659264;visibility:visible;mso-wrap-style:square;mso-width-percent:400;mso-height-percent:700;mso-left-percent:440;mso-top-percent:25;mso-wrap-distance-left:9pt;mso-wrap-distance-top:0;mso-wrap-distance-right:9pt;mso-wrap-distance-bottom:0;mso-position-horizontal-relative:page;mso-position-vertical-relative:page;mso-width-percent:400;mso-height-percent:700;mso-left-percent:440;mso-top-percent:25;mso-width-relative:page;mso-height-relative:page;v-text-anchor:middle" o:gfxdata="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" fillcolor="white [3212]" strokecolor="#666972 [1614]" strokeweight="1.25pt">
+                    <w10:wrap anchorx="page" anchory="page"/>
+                  </v:rect>
+                </w:pict>
+              </mc:Fallback>
+            </mc:AlternateContent>
+          </w:r>
+          <w:r>
+            <w:rPr>
+              <w:noProof/>
+            </w:rPr>
+            <mc:AlternateContent>
+              <mc:Choice Requires="wps">
+                <w:drawing>
+                  <wp:anchor distT="0" distB="0" distL="114300" distR="114300" simplePos="0" relativeHeight="251662336" behindDoc="0" locked="0" layoutInCell="1" allowOverlap="1" wp14:anchorId="1009E600" wp14:editId="66C953AE">
+                    <wp:simplePos x="0" y="0"/>
+                    <mc:AlternateContent>
+                      <mc:Choice Requires="wp14">
+                        <wp:positionH relativeFrom="page">
+                          <wp14:pctPosHOffset>45500</wp14:pctPosHOffset>
+                        </wp:positionH>
+                      </mc:Choice>
+                      <mc:Fallback>
+                        <wp:positionH relativeFrom="page">
+                          <wp:posOffset>3439795</wp:posOffset>
+                        </wp:positionH>
+                      </mc:Fallback>
+                    </mc:AlternateContent>
+                    <mc:AlternateContent>
+                      <mc:Choice Requires="wp14">
+                        <wp:positionV relativeFrom="page">
+                          <wp14:pctPosVOffset>69000</wp14:pctPosVOffset>
+                        </wp:positionV>
+                      </mc:Choice>
+                      <mc:Fallback>
+                        <wp:positionV relativeFrom="page">
+                          <wp:posOffset>7377430</wp:posOffset>
+                        </wp:positionV>
+                      </mc:Fallback>
+                    </mc:AlternateContent>
+                    <wp:extent cx="2875915" cy="118745"/>
+                    <wp:effectExtent l="0" t="0" r="0" b="0"/>
+                    <wp:wrapNone/>
+                    <wp:docPr id="469" name="Rectangle 263"/>
+                    <wp:cNvGraphicFramePr/>
+                    <a:graphic xmlns:a="http://schemas.openxmlformats.org/drawingml/2006/main">
+                      <a:graphicData uri="http://schemas.microsoft.com/office/word/2010/wordprocessingShape">
+                        <wps:wsp>
+                          <wps:cNvSpPr/>
+                          <wps:spPr>
+                            <a:xfrm>
+                              <a:off x="0" y="0"/>
+                              <a:ext cx="2875915" cy="118745"/>
+                            </a:xfrm>
+                            <a:prstGeom prst="rect">
+                              <a:avLst/>
+                            </a:prstGeom>
+                            <a:ln>
+                              <a:noFill/>
+                            </a:ln>
+                          </wps:spPr>
+                          <wps:style>
+                            <a:lnRef idx="2">
+                              <a:schemeClr val="accent1">
+                                <a:shade val="50000"/>
+                              </a:schemeClr>
+                            </a:lnRef>
+                            <a:fillRef idx="1">
+                              <a:schemeClr val="accent1"/>
+                            </a:fillRef>
+                            <a:effectRef idx="0">
+                              <a:schemeClr val="accent1"/>
+                            </a:effectRef>
+                            <a:fontRef idx="minor">
+                              <a:schemeClr val="lt1"/>
+                            </a:fontRef>
+                          </wps:style>
+                          <wps:bodyPr rot="0" spcFirstLastPara="0" vertOverflow="overflow" horzOverflow="overflow" vert="horz" wrap="square" lIns="91440" tIns="45720" rIns="91440" bIns="45720" numCol="1" spcCol="0" rtlCol="0" fromWordArt="0" anchor="ctr" anchorCtr="0" forceAA="0" compatLnSpc="1">
+                            <a:prstTxWarp prst="textNoShape">
+                              <a:avLst/>
+                            </a:prstTxWarp>
+                            <a:noAutofit/>
+                          </wps:bodyPr>
+                        </wps:wsp>
+                      </a:graphicData>
+                    </a:graphic>
+                    <wp14:sizeRelH relativeFrom="page">
+                      <wp14:pctWidth>37000</wp14:pctWidth>
+                    </wp14:sizeRelH>
+                    <wp14:sizeRelV relativeFrom="margin">
+                      <wp14:pctHeight>0</wp14:pctHeight>
+                    </wp14:sizeRelV>
+                  </wp:anchor>
+                </w:drawing>
+              </mc:Choice>
+              <mc:Fallback>
+                <w:pict>
+                  <v:rect w14:anchorId="310A11DB" id="Rectangle 263" o:spid="_x0000_s1026" style="position:absolute;margin-left:0;margin-top:0;width:226.45pt;height:9.35pt;z-index:251662336;visibility:visible;mso-wrap-style:square;mso-width-percent:370;mso-height-percent:0;mso-left-percent:455;mso-top-percent:690;mso-wrap-distance-left:9pt;mso-wrap-distance-top:0;mso-wrap-distance-right:9pt;mso-wrap-distance-bottom:0;mso-position-horizontal-relative:page;mso-position-vertical-relative:page;mso-width-percent:370;mso-height-percent:0;mso-left-percent:455;mso-top-percent:690;mso-width-relative:page;mso-height-relative:margin;v-text-anchor:middle" o:gfxdata="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" fillcolor="#e32d91 [3204]" stroked="f" strokeweight="1.5pt">
+                    <w10:wrap anchorx="page" anchory="page"/>
+                  </v:rect>
+                </w:pict>
+              </mc:Fallback>
+            </mc:AlternateContent>
+          </w:r>
+          <w:r>
+            <w:rPr>
+              <w:noProof/>
+            </w:rPr>
+            <mc:AlternateContent>
+              <mc:Choice Requires="wps">
+                <w:drawing>
+                  <wp:anchor distT="0" distB="0" distL="114300" distR="114300" simplePos="0" relativeHeight="251661312" behindDoc="0" locked="0" layoutInCell="1" allowOverlap="1" wp14:anchorId="549C3791" wp14:editId="080C8B19">
+                    <wp:simplePos x="0" y="0"/>
+                    <mc:AlternateContent>
+                      <mc:Choice Requires="wp14">
+                        <wp:positionH relativeFrom="page">
+                          <wp14:pctPosHOffset>45500</wp14:pctPosHOffset>
+                        </wp:positionH>
+                      </mc:Choice>
+                      <mc:Fallback>
+                        <wp:positionH relativeFrom="page">
+                          <wp:posOffset>3439795</wp:posOffset>
+                        </wp:positionH>
+                      </mc:Fallback>
+                    </mc:AlternateContent>
+                    <mc:AlternateContent>
+                      <mc:Choice Requires="wp14">
+                        <wp:positionV relativeFrom="page">
+                          <wp14:pctPosVOffset>35000</wp14:pctPosVOffset>
+                        </wp:positionV>
+                      </mc:Choice>
+                      <mc:Fallback>
+                        <wp:positionV relativeFrom="page">
+                          <wp:posOffset>3742055</wp:posOffset>
+                        </wp:positionV>
+                      </mc:Fallback>
+                    </mc:AlternateContent>
+                    <wp:extent cx="2797810" cy="2475230"/>
+                    <wp:effectExtent l="0" t="0" r="0" b="0"/>
+                    <wp:wrapSquare wrapText="bothSides"/>
+                    <wp:docPr id="470" name="Text Box 265"/>
+                    <wp:cNvGraphicFramePr/>
+                    <a:graphic xmlns:a="http://schemas.openxmlformats.org/drawingml/2006/main">
+                      <a:graphicData uri="http://schemas.microsoft.com/office/word/2010/wordprocessingShape">
+                        <wps:wsp>
+                          <wps:cNvSpPr txBox="1"/>
+                          <wps:spPr>
+                            <a:xfrm>
+                              <a:off x="0" y="0"/>
+                              <a:ext cx="2797810" cy="2475230"/>
+                            </a:xfrm>
+                            <a:prstGeom prst="rect">
+                              <a:avLst/>
+                            </a:prstGeom>
+                            <a:noFill/>
+                            <a:ln w="6350">
+                              <a:noFill/>
+                            </a:ln>
+                            <a:effectLst/>
+                          </wps:spPr>
+                          <wps:txbx>
+                            <w:txbxContent>
+                              <w:sdt>
+                                <w:sdtPr>
+                                  <w:rPr>
+                                    <w:rFonts w:asciiTheme="majorHAnsi" w:eastAsiaTheme="majorEastAsia" w:hAnsiTheme="majorHAnsi" w:cstheme="majorBidi"/>
+                                    <w:noProof/>
+                                    <w:color w:val="E32D91" w:themeColor="accent1"/>
+                                    <w:sz w:val="72"/>
+                                    <w:szCs w:val="72"/>
+                                  </w:rPr>
+                                  <w:alias w:val="Title"/>
+                                  <w:id w:val="-958338334"/>
+                                  <w:dataBinding w:prefixMappings="xmlns:ns0='http://schemas.openxmlformats.org/package/2006/metadata/core-properties' xmlns:ns1='http://purl.org/dc/elements/1.1/'" w:xpath="/ns0:coreProperties[1]/ns1:title[1]" w:storeItemID="{6C3C8BC8-F283-45AE-878A-BAB7291924A1}"/>
+                                  <w:text/>
+                                </w:sdtPr>
+                                <w:sdtContent>
+                                  <w:p>
+                                    <w:pPr>
+                                      <w:spacing w:line="240" w:lineRule="auto"/>
+                                      <w:rPr>
+                                        <w:rFonts w:asciiTheme="majorHAnsi" w:eastAsiaTheme="majorEastAsia" w:hAnsiTheme="majorHAnsi" w:cstheme="majorBidi"/>
+                                        <w:noProof/>
+                                        <w:color w:val="E32D91" w:themeColor="accent1"/>
+                                        <w:sz w:val="72"/>
+                                        <w:szCs w:val="144"/>
+                                      </w:rPr>
+                                    </w:pPr>
+                                    <w:r>
+                                      <w:rPr>
+                                        <w:rFonts w:asciiTheme="majorHAnsi" w:eastAsiaTheme="majorEastAsia" w:hAnsiTheme="majorHAnsi" w:cstheme="majorBidi"/>
+                                        <w:noProof/>
+                                        <w:color w:val="E32D91" w:themeColor="accent1"/>
+                                        <w:sz w:val="72"/>
+                                        <w:szCs w:val="72"/>
+                                      </w:rPr>
+                                      <w:t>Number Guessing Game</w:t>
+                                    </w:r>
+                                  </w:p>
+                                </w:sdtContent>
+                              </w:sdt>
+                              <w:sdt>
+                                <w:sdtPr>
+                                  <w:rPr>
+                                    <w:rFonts w:asciiTheme="majorHAnsi" w:eastAsiaTheme="majorEastAsia" w:hAnsiTheme="majorHAnsi" w:cstheme="majorBidi"/>
+                                    <w:noProof/>
+                                    <w:color w:val="454551" w:themeColor="text2"/>
+                                    <w:sz w:val="32"/>
+                                    <w:szCs w:val="32"/>
+                                  </w:rPr>
+                                  <w:alias w:val="Subtitle"/>
+                                  <w:id w:val="15524255"/>
+                                  <w:dataBinding w:prefixMappings="xmlns:ns0='http://schemas.openxmlformats.org/package/2006/metadata/core-properties' xmlns:ns1='http://purl.org/dc/elements/1.1/'" w:xpath="/ns0:coreProperties[1]/ns1:subject[1]" w:storeItemID="{6C3C8BC8-F283-45AE-878A-BAB7291924A1}"/>
+                                  <w:text/>
+                                </w:sdtPr>
+                                <w:sdtContent>
+                                  <w:p>
+                                    <w:pPr>
+                                      <w:rPr>
+                                        <w:rFonts w:asciiTheme="majorHAnsi" w:eastAsiaTheme="majorEastAsia" w:hAnsiTheme="majorHAnsi" w:cstheme="majorBidi"/>
+                                        <w:noProof/>
+                                        <w:color w:val="454551" w:themeColor="text2"/>
+                                        <w:sz w:val="32"/>
+                                        <w:szCs w:val="40"/>
+                                      </w:rPr>
+                                    </w:pPr>
+                                    <w:r>
+                                      <w:rPr>
+                                        <w:rFonts w:asciiTheme="majorHAnsi" w:eastAsiaTheme="majorEastAsia" w:hAnsiTheme="majorHAnsi" w:cstheme="majorBidi"/>
+                                        <w:noProof/>
+                                        <w:color w:val="454551" w:themeColor="text2"/>
+                                        <w:sz w:val="32"/>
+                                        <w:szCs w:val="32"/>
+                                      </w:rPr>
+                                      <w:t>A Portofolio Project</w:t>
+                                    </w:r>
+                                  </w:p>
+                                </w:sdtContent>
+                              </w:sdt>
+                            </w:txbxContent>
+                          </wps:txbx>
+                          <wps:bodyPr rot="0" spcFirstLastPara="0" vertOverflow="overflow" horzOverflow="overflow" vert="horz" wrap="square" lIns="91440" tIns="45720" rIns="91440" bIns="45720" numCol="1" spcCol="0" rtlCol="0" fromWordArt="0" anchor="t" anchorCtr="0" forceAA="0" compatLnSpc="1">
+                            <a:prstTxWarp prst="textNoShape">
+                              <a:avLst/>
+                            </a:prstTxWarp>
+                            <a:spAutoFit/>
+                          </wps:bodyPr>
+                        </wps:wsp>
+                      </a:graphicData>
+                    </a:graphic>
+                    <wp14:sizeRelH relativeFrom="page">
+                      <wp14:pctWidth>36000</wp14:pctWidth>
+                    </wp14:sizeRelH>
+                    <wp14:sizeRelV relativeFrom="page">
+                      <wp14:pctHeight>28000</wp14:pctHeight>
+                    </wp14:sizeRelV>
+                  </wp:anchor>
+                </w:drawing>
+              </mc:Choice>
+              <mc:Fallback>
+                <w:pict>
+                  <v:shape w14:anchorId="549C3791" id="Text Box 265" o:spid="_x0000_s1029" type="#_x0000_t202" style="position:absolute;margin-left:0;margin-top:0;width:220.3pt;height:194.9pt;z-index:251661312;visibility:visible;mso-wrap-style:square;mso-width-percent:360;mso-height-percent:280;mso-left-percent:455;mso-top-percent:350;mso-wrap-distance-left:9pt;mso-wrap-distance-top:0;mso-wrap-distance-right:9pt;mso-wrap-distance-bottom:0;mso-position-horizontal-relative:page;mso-position-vertical-relative:page;mso-width-percent:360;mso-height-percent:280;mso-left-percent:455;mso-top-percent:350;mso-width-relative:page;mso-height-relative:page;v-text-anchor:top" o:gfxdata="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" filled="f" stroked="f" strokeweight=".5pt">
+                    <v:textbox style="mso-fit-shape-to-text:t">
+                      <w:txbxContent>
+                        <w:sdt>
+                          <w:sdtPr>
+                            <w:rPr>
+                              <w:rFonts w:asciiTheme="majorHAnsi" w:eastAsiaTheme="majorEastAsia" w:hAnsiTheme="majorHAnsi" w:cstheme="majorBidi"/>
+                              <w:noProof/>
+                              <w:color w:val="E32D91" w:themeColor="accent1"/>
+                              <w:sz w:val="72"/>
+                              <w:szCs w:val="72"/>
+                            </w:rPr>
+                            <w:alias w:val="Title"/>
+                            <w:id w:val="-958338334"/>
+                            <w:dataBinding w:prefixMappings="xmlns:ns0='http://schemas.openxmlformats.org/package/2006/metadata/core-properties' xmlns:ns1='http://purl.org/dc/elements/1.1/'" w:xpath="/ns0:coreProperties[1]/ns1:title[1]" w:storeItemID="{6C3C8BC8-F283-45AE-878A-BAB7291924A1}"/>
+                            <w:text/>
+                          </w:sdtPr>
+                          <w:sdtContent>
+                            <w:p>
+                              <w:pPr>
+                                <w:spacing w:line="240" w:lineRule="auto"/>
+                                <w:rPr>
+                                  <w:rFonts w:asciiTheme="majorHAnsi" w:eastAsiaTheme="majorEastAsia" w:hAnsiTheme="majorHAnsi" w:cstheme="majorBidi"/>
+                                  <w:noProof/>
+                                  <w:color w:val="E32D91" w:themeColor="accent1"/>
+                                  <w:sz w:val="72"/>
+                                  <w:szCs w:val="144"/>
+                                </w:rPr>
+                              </w:pPr>
+                              <w:r>
+                                <w:rPr>
+                                  <w:rFonts w:asciiTheme="majorHAnsi" w:eastAsiaTheme="majorEastAsia" w:hAnsiTheme="majorHAnsi" w:cstheme="majorBidi"/>
+                                  <w:noProof/>
+                                  <w:color w:val="E32D91" w:themeColor="accent1"/>
+                                  <w:sz w:val="72"/>
+                                  <w:szCs w:val="72"/>
+                                </w:rPr>
+                                <w:t>Number Guessing Game</w:t>
+                              </w:r>
+                            </w:p>
+                          </w:sdtContent>
+                        </w:sdt>
+                        <w:sdt>
+                          <w:sdtPr>
+                            <w:rPr>
+                              <w:rFonts w:asciiTheme="majorHAnsi" w:eastAsiaTheme="majorEastAsia" w:hAnsiTheme="majorHAnsi" w:cstheme="majorBidi"/>
+                              <w:noProof/>
+                              <w:color w:val="454551" w:themeColor="text2"/>
+                              <w:sz w:val="32"/>
+                              <w:szCs w:val="32"/>
+                            </w:rPr>
+                            <w:alias w:val="Subtitle"/>
+                            <w:id w:val="15524255"/>
+                            <w:dataBinding w:prefixMappings="xmlns:ns0='http://schemas.openxmlformats.org/package/2006/metadata/core-properties' xmlns:ns1='http://purl.org/dc/elements/1.1/'" w:xpath="/ns0:coreProperties[1]/ns1:subject[1]" w:storeItemID="{6C3C8BC8-F283-45AE-878A-BAB7291924A1}"/>
+                            <w:text/>
+                          </w:sdtPr>
+                          <w:sdtContent>
+                            <w:p>
+                              <w:pPr>
+                                <w:rPr>
+                                  <w:rFonts w:asciiTheme="majorHAnsi" w:eastAsiaTheme="majorEastAsia" w:hAnsiTheme="majorHAnsi" w:cstheme="majorBidi"/>
+                                  <w:noProof/>
+                                  <w:color w:val="454551" w:themeColor="text2"/>
+                                  <w:sz w:val="32"/>
+                                  <w:szCs w:val="40"/>
+                                </w:rPr>
+                              </w:pPr>
+                              <w:r>
+                                <w:rPr>
+                                  <w:rFonts w:asciiTheme="majorHAnsi" w:eastAsiaTheme="majorEastAsia" w:hAnsiTheme="majorHAnsi" w:cstheme="majorBidi"/>
+                                  <w:noProof/>
+                                  <w:color w:val="454551" w:themeColor="text2"/>
+                                  <w:sz w:val="32"/>
+                                  <w:szCs w:val="32"/>
+                                </w:rPr>
+                                <w:t>A Portofolio Project</w:t>
+                              </w:r>
+                            </w:p>
+                          </w:sdtContent>
+                        </w:sdt>
+                      </w:txbxContent>
+                    </v:textbox>
+                    <w10:wrap type="square" anchorx="page" anchory="page"/>
+                  </v:shape>
+                </w:pict>
+              </mc:Fallback>
+            </mc:AlternateContent>
+          </w:r>
+        </w:p>
+        <w:p>
+          <w:r>
+            <w:br w:type="page"/>
+          </w:r>
+        </w:p>
+      </w:sdtContent>
+    </w:sdt>
+    <w:sdt>
+      <w:sdtPr>
+        <w:id w:val="327105397"/>
+        <w:docPartObj>
+          <w:docPartGallery w:val="Table of Contents"/>
+          <w:docPartUnique/>
+        </w:docPartObj>
+      </w:sdtPr>
+      <w:sdtEndPr>
         <w:rPr>
-          <w:rStyle w:val="SubtleEmphasis"/>
+          <w:rFonts w:asciiTheme="minorHAnsi" w:eastAsiaTheme="minorEastAsia" w:hAnsiTheme="minorHAnsi" w:cstheme="minorBidi"/>
+          <w:b/>
+          <w:bCs/>
+          <w:noProof/>
+          <w:color w:val="auto"/>
+          <w:sz w:val="21"/>
+          <w:szCs w:val="21"/>
         </w:rPr>
-      </w:pPr>
-      <w:r>
-        <w:rPr>
-          <w:rStyle w:val="SubtleEmphasis"/>
-        </w:rPr>
-        <w:t>By Alexandra Danciu</w:t>
-      </w:r>
-    </w:p>
+      </w:sdtEndPr>
+      <w:sdtContent>
+        <w:p>
+          <w:pPr>
+            <w:pStyle w:val="Heading1"/>
+          </w:pPr>
+          <w:r>
+            <w:t>Table of Contents</w:t>
+          </w:r>
+        </w:p>
+        <w:p>
+          <w:pPr>
+            <w:pStyle w:val="TOC1"/>
+            <w:tabs>
+              <w:tab w:val="right" w:leader="dot" w:pos="9016"/>
+            </w:tabs>
+            <w:rPr>
+              <w:noProof/>
+            </w:rPr>
+          </w:pPr>
+          <w:r>
+            <w:fldChar w:fldCharType="begin"/>
+          </w:r>
+          <w:r>
+            <w:instrText xml:space="preserve"> TOC \o "1-3" \h \z \u </w:instrText>
+          </w:r>
+          <w:r>
+            <w:fldChar w:fldCharType="separate"/>
+          </w:r>
+          <w:hyperlink w:anchor="_Toc206632508" w:history="1">
+            <w:r>
+              <w:rPr>
+                <w:rStyle w:val="Hyperlink"/>
+                <w:noProof/>
+              </w:rPr>
+              <w:t>Index</w:t>
+            </w:r>
+            <w:r>
+              <w:rPr>
+                <w:noProof/>
+                <w:webHidden/>
+              </w:rPr>
+              <w:tab/>
+            </w:r>
+            <w:r>
+              <w:rPr>
+                <w:noProof/>
+                <w:webHidden/>
+              </w:rPr>
+              <w:fldChar w:fldCharType="begin"/>
+            </w:r>
+            <w:r>
+              <w:rPr>
+                <w:noProof/>
+                <w:webHidden/>
+              </w:rPr>
+              <w:instrText xml:space="preserve"> PAGEREF _Toc206632508 \h </w:instrText>
+            </w:r>
+            <w:r>
+              <w:rPr>
+                <w:noProof/>
+                <w:webHidden/>
+              </w:rPr>
+            </w:r>
+            <w:r>
+              <w:rPr>
+                <w:noProof/>
+                <w:webHidden/>
+              </w:rPr>
+              <w:fldChar w:fldCharType="separate"/>
+            </w:r>
+            <w:r>
+              <w:rPr>
+                <w:noProof/>
+                <w:webHidden/>
+              </w:rPr>
+              <w:t>1</w:t>
+            </w:r>
+            <w:r>
+              <w:rPr>
+                <w:noProof/>
+                <w:webHidden/>
+              </w:rPr>
+              <w:fldChar w:fldCharType="end"/>
+            </w:r>
+          </w:hyperlink>
+        </w:p>
+        <w:p>
+          <w:pPr>
+            <w:pStyle w:val="TOC1"/>
+            <w:tabs>
+              <w:tab w:val="right" w:leader="dot" w:pos="9016"/>
+            </w:tabs>
+            <w:rPr>
+              <w:noProof/>
+            </w:rPr>
+          </w:pPr>
+          <w:hyperlink w:anchor="_Toc206632509" w:history="1">
+            <w:r>
+              <w:rPr>
+                <w:rStyle w:val="Hyperlink"/>
+                <w:noProof/>
+              </w:rPr>
+              <w:t>Introduction</w:t>
+            </w:r>
+            <w:r>
+              <w:rPr>
+                <w:noProof/>
+                <w:webHidden/>
+              </w:rPr>
+              <w:tab/>
+            </w:r>
+            <w:r>
+              <w:rPr>
+                <w:noProof/>
+                <w:webHidden/>
+              </w:rPr>
+              <w:fldChar w:fldCharType="begin"/>
+            </w:r>
+            <w:r>
+              <w:rPr>
+                <w:noProof/>
+                <w:webHidden/>
+              </w:rPr>
+              <w:instrText xml:space="preserve"> PAGEREF _Toc206632509 \h </w:instrText>
+            </w:r>
+            <w:r>
+              <w:rPr>
+                <w:noProof/>
+                <w:webHidden/>
+              </w:rPr>
+            </w:r>
+            <w:r>
+              <w:rPr>
+                <w:noProof/>
+                <w:webHidden/>
+              </w:rPr>
+              <w:fldChar w:fldCharType="separate"/>
+            </w:r>
+            <w:r>
+              <w:rPr>
+                <w:noProof/>
+                <w:webHidden/>
+              </w:rPr>
+              <w:t>2</w:t>
+            </w:r>
+            <w:r>
+              <w:rPr>
+                <w:noProof/>
+                <w:webHidden/>
+              </w:rPr>
+              <w:fldChar w:fldCharType="end"/>
+            </w:r>
+          </w:hyperlink>
+        </w:p>
+        <w:p>
+          <w:pPr>
+            <w:pStyle w:val="TOC1"/>
+            <w:tabs>
+              <w:tab w:val="right" w:leader="dot" w:pos="9016"/>
+            </w:tabs>
+            <w:rPr>
+              <w:noProof/>
+            </w:rPr>
+          </w:pPr>
+          <w:hyperlink w:anchor="_Toc206632510" w:history="1">
+            <w:r>
+              <w:rPr>
+                <w:rStyle w:val="Hyperlink"/>
+                <w:noProof/>
+              </w:rPr>
+              <w:t>Project Overview</w:t>
+            </w:r>
+            <w:r>
+              <w:rPr>
+                <w:noProof/>
+                <w:webHidden/>
+              </w:rPr>
+              <w:tab/>
+            </w:r>
+            <w:r>
+              <w:rPr>
+                <w:noProof/>
+                <w:webHidden/>
+              </w:rPr>
+              <w:fldChar w:fldCharType="begin"/>
+            </w:r>
+            <w:r>
+              <w:rPr>
+                <w:noProof/>
+                <w:webHidden/>
+              </w:rPr>
+              <w:instrText xml:space="preserve"> PAGEREF _Toc206632510 \h </w:instrText>
+            </w:r>
+            <w:r>
+              <w:rPr>
+                <w:noProof/>
+                <w:webHidden/>
+              </w:rPr>
+            </w:r>
+            <w:r>
+              <w:rPr>
+                <w:noProof/>
+                <w:webHidden/>
+              </w:rPr>
+              <w:fldChar w:fldCharType="separate"/>
+            </w:r>
+            <w:r>
+              <w:rPr>
+                <w:noProof/>
+                <w:webHidden/>
+              </w:rPr>
+              <w:t>2</w:t>
+            </w:r>
+            <w:r>
+              <w:rPr>
+                <w:noProof/>
+                <w:webHidden/>
+              </w:rPr>
+              <w:fldChar w:fldCharType="end"/>
+            </w:r>
+          </w:hyperlink>
+        </w:p>
+        <w:p>
+          <w:pPr>
+            <w:pStyle w:val="TOC1"/>
+            <w:tabs>
+              <w:tab w:val="right" w:leader="dot" w:pos="9016"/>
+            </w:tabs>
+            <w:rPr>
+              <w:noProof/>
+            </w:rPr>
+          </w:pPr>
+          <w:hyperlink w:anchor="_Toc206632511" w:history="1">
+            <w:r>
+              <w:rPr>
+                <w:rStyle w:val="Hyperlink"/>
+                <w:noProof/>
+              </w:rPr>
+              <w:t>Initial Requirements</w:t>
+            </w:r>
+            <w:r>
+              <w:rPr>
+                <w:noProof/>
+                <w:webHidden/>
+              </w:rPr>
+              <w:tab/>
+            </w:r>
+            <w:r>
+              <w:rPr>
+                <w:noProof/>
+                <w:webHidden/>
+              </w:rPr>
+              <w:fldChar w:fldCharType="begin"/>
+            </w:r>
+            <w:r>
+              <w:rPr>
+                <w:noProof/>
+                <w:webHidden/>
+              </w:rPr>
+              <w:instrText xml:space="preserve"> PAGEREF _Toc206632511 \h </w:instrText>
+            </w:r>
+            <w:r>
+              <w:rPr>
+                <w:noProof/>
+                <w:webHidden/>
+              </w:rPr>
+            </w:r>
+            <w:r>
+              <w:rPr>
+                <w:noProof/>
+                <w:webHidden/>
+              </w:rPr>
+              <w:fldChar w:fldCharType="separate"/>
+            </w:r>
+            <w:r>
+              <w:rPr>
+                <w:noProof/>
+                <w:webHidden/>
+              </w:rPr>
+              <w:t>2</w:t>
+            </w:r>
+            <w:r>
+              <w:rPr>
+                <w:noProof/>
+                <w:webHidden/>
+              </w:rPr>
+              <w:fldChar w:fldCharType="end"/>
+            </w:r>
+          </w:hyperlink>
+        </w:p>
+        <w:p>
+          <w:pPr>
+            <w:pStyle w:val="TOC1"/>
+            <w:tabs>
+              <w:tab w:val="right" w:leader="dot" w:pos="9016"/>
+            </w:tabs>
+            <w:rPr>
+              <w:noProof/>
+            </w:rPr>
+          </w:pPr>
+          <w:hyperlink w:anchor="_Toc206632512" w:history="1">
+            <w:r>
+              <w:rPr>
+                <w:rStyle w:val="Hyperlink"/>
+                <w:noProof/>
+              </w:rPr>
+              <w:t>Further Developments</w:t>
+            </w:r>
+            <w:r>
+              <w:rPr>
+                <w:noProof/>
+                <w:webHidden/>
+              </w:rPr>
+              <w:tab/>
+            </w:r>
+            <w:r>
+              <w:rPr>
+                <w:noProof/>
+                <w:webHidden/>
+              </w:rPr>
+              <w:fldChar w:fldCharType="begin"/>
+            </w:r>
+            <w:r>
+              <w:rPr>
+                <w:noProof/>
+                <w:webHidden/>
+              </w:rPr>
+              <w:instrText xml:space="preserve"> PAGEREF _Toc206632512 \h </w:instrText>
+            </w:r>
+            <w:r>
+              <w:rPr>
+                <w:noProof/>
+                <w:webHidden/>
+              </w:rPr>
+            </w:r>
+            <w:r>
+              <w:rPr>
+                <w:noProof/>
+                <w:webHidden/>
+              </w:rPr>
+              <w:fldChar w:fldCharType="separate"/>
+            </w:r>
+            <w:r>
+              <w:rPr>
+                <w:noProof/>
+                <w:webHidden/>
+              </w:rPr>
+              <w:t>2</w:t>
+            </w:r>
+            <w:r>
+              <w:rPr>
+                <w:noProof/>
+                <w:webHidden/>
+              </w:rPr>
+              <w:fldChar w:fldCharType="end"/>
+            </w:r>
+          </w:hyperlink>
+        </w:p>
+        <w:p>
+          <w:pPr>
+            <w:pStyle w:val="TOC1"/>
+            <w:tabs>
+              <w:tab w:val="right" w:leader="dot" w:pos="9016"/>
+            </w:tabs>
+            <w:rPr>
+              <w:noProof/>
+            </w:rPr>
+          </w:pPr>
+          <w:hyperlink w:anchor="_Toc206632513" w:history="1">
+            <w:r>
+              <w:rPr>
+                <w:rStyle w:val="Hyperlink"/>
+                <w:noProof/>
+              </w:rPr>
+              <w:t>Reflections</w:t>
+            </w:r>
+            <w:r>
+              <w:rPr>
+                <w:noProof/>
+                <w:webHidden/>
+              </w:rPr>
+              <w:tab/>
+            </w:r>
+            <w:r>
+              <w:rPr>
+                <w:noProof/>
+                <w:webHidden/>
+              </w:rPr>
+              <w:fldChar w:fldCharType="begin"/>
+            </w:r>
+            <w:r>
+              <w:rPr>
+                <w:noProof/>
+                <w:webHidden/>
+              </w:rPr>
+              <w:instrText xml:space="preserve"> PAGEREF _Toc206632513 \h </w:instrText>
+            </w:r>
+            <w:r>
+              <w:rPr>
+                <w:noProof/>
+                <w:webHidden/>
+              </w:rPr>
+            </w:r>
+            <w:r>
+              <w:rPr>
+                <w:noProof/>
+                <w:webHidden/>
+              </w:rPr>
+              <w:fldChar w:fldCharType="separate"/>
+            </w:r>
+            <w:r>
+              <w:rPr>
+                <w:noProof/>
+                <w:webHidden/>
+              </w:rPr>
+              <w:t>2</w:t>
+            </w:r>
+            <w:r>
+              <w:rPr>
+                <w:noProof/>
+                <w:webHidden/>
+              </w:rPr>
+              <w:fldChar w:fldCharType="end"/>
+            </w:r>
+          </w:hyperlink>
+        </w:p>
+        <w:p>
+          <w:pPr>
+            <w:pStyle w:val="TOC1"/>
+            <w:tabs>
+              <w:tab w:val="right" w:leader="dot" w:pos="9016"/>
+            </w:tabs>
+            <w:rPr>
+              <w:noProof/>
+            </w:rPr>
+          </w:pPr>
+          <w:hyperlink w:anchor="_Toc206632514" w:history="1">
+            <w:r>
+              <w:rPr>
+                <w:rStyle w:val="Hyperlink"/>
+                <w:noProof/>
+              </w:rPr>
+              <w:t>Conclusion</w:t>
+            </w:r>
+            <w:r>
+              <w:rPr>
+                <w:noProof/>
+                <w:webHidden/>
+              </w:rPr>
+              <w:tab/>
+            </w:r>
+            <w:r>
+              <w:rPr>
+                <w:noProof/>
+                <w:webHidden/>
+              </w:rPr>
+              <w:fldChar w:fldCharType="begin"/>
+            </w:r>
+            <w:r>
+              <w:rPr>
+                <w:noProof/>
+                <w:webHidden/>
+              </w:rPr>
+              <w:instrText xml:space="preserve"> PAGEREF _Toc206632514 \h </w:instrText>
+            </w:r>
+            <w:r>
+              <w:rPr>
+                <w:noProof/>
+                <w:webHidden/>
+              </w:rPr>
+            </w:r>
+            <w:r>
+              <w:rPr>
+                <w:noProof/>
+                <w:webHidden/>
+              </w:rPr>
+              <w:fldChar w:fldCharType="separate"/>
+            </w:r>
+            <w:r>
+              <w:rPr>
+                <w:noProof/>
+                <w:webHidden/>
+              </w:rPr>
+              <w:t>2</w:t>
+            </w:r>
+            <w:r>
+              <w:rPr>
+                <w:noProof/>
+                <w:webHidden/>
+              </w:rPr>
+              <w:fldChar w:fldCharType="end"/>
+            </w:r>
+          </w:hyperlink>
+        </w:p>
+        <w:p>
+          <w:r>
+            <w:rPr>
+              <w:b/>
+              <w:bCs/>
+              <w:noProof/>
+            </w:rPr>
+            <w:fldChar w:fldCharType="end"/>
+          </w:r>
+        </w:p>
+      </w:sdtContent>
+    </w:sdt>
+    <w:p/>
+    <w:p/>
+    <w:p/>
+    <w:p/>
+    <w:p/>
+    <w:p/>
+    <w:p/>
+    <w:p/>
+    <w:p/>
+    <w:p/>
     <w:p/>
     <w:p/>
     <w:p/>
@@ -85,10 +1417,12 @@
       <w:pPr>
         <w:pStyle w:val="Heading1"/>
       </w:pPr>
+      <w:bookmarkStart w:id="0" w:name="_Toc206632509"/>
       <w:r>
         <w:lastRenderedPageBreak/>
-        <w:t>Index</w:t>
+        <w:t>Introduction</w:t>
       </w:r>
+      <w:bookmarkEnd w:id="0"/>
     </w:p>
     <w:p/>
     <w:p/>
@@ -97,8 +1431,13 @@
       <w:pPr>
         <w:pStyle w:val="Heading1"/>
       </w:pPr>
+      <w:bookmarkStart w:id="1" w:name="_Toc206632510"/>
       <w:r>
-        <w:t>Introduction</w:t>
+        <w:t>Project Overview</w:t>
+      </w:r>
+      <w:bookmarkEnd w:id="1"/>
+      <w:r>
+        <w:t xml:space="preserve"> </w:t>
       </w:r>
     </w:p>
     <w:p/>
@@ -108,18 +1447,215 @@
       <w:pPr>
         <w:pStyle w:val="Heading1"/>
       </w:pPr>
+      <w:bookmarkStart w:id="2" w:name="_Toc206632511"/>
       <w:r>
-        <w:t xml:space="preserve">Project Overview </w:t>
+        <w:t>Initial Requirements</w:t>
       </w:r>
+      <w:bookmarkEnd w:id="2"/>
+    </w:p>
+    <w:p/>
+    <w:p/>
+    <w:p/>
+    <w:p>
+      <w:pPr>
+        <w:pStyle w:val="Heading1"/>
+      </w:pPr>
+      <w:bookmarkStart w:id="3" w:name="_Toc206632512"/>
+      <w:r>
+        <w:t>Further Developments</w:t>
+      </w:r>
+      <w:bookmarkEnd w:id="3"/>
+    </w:p>
+    <w:p/>
+    <w:p/>
+    <w:p/>
+    <w:p>
+      <w:pPr>
+        <w:pStyle w:val="Heading1"/>
+      </w:pPr>
+      <w:bookmarkStart w:id="4" w:name="_Toc206632513"/>
+      <w:r>
+        <w:t>Reflections</w:t>
+      </w:r>
+      <w:bookmarkEnd w:id="4"/>
+    </w:p>
+    <w:p/>
+    <w:p/>
+    <w:p/>
+    <w:p>
+      <w:pPr>
+        <w:pStyle w:val="Heading1"/>
+      </w:pPr>
+      <w:bookmarkStart w:id="5" w:name="_Toc206632514"/>
+      <w:r>
+        <w:t>Conclusion</w:t>
+      </w:r>
+      <w:bookmarkEnd w:id="5"/>
     </w:p>
     <w:sectPr>
+      <w:footerReference w:type="default" r:id="rId7"/>
       <w:pgSz w:w="11906" w:h="16838"/>
-      <w:pgMar w:top="1440" w:right="1440" w:bottom="1440" w:left="1440" w:header="708" w:footer="708" w:gutter="0"/>
+      <w:pgMar w:top="1440" w:right="1440" w:bottom="1440" w:left="1440" w:header="708" w:footer="283" w:gutter="0"/>
+      <w:pgNumType w:start="0"/>
       <w:cols w:space="708"/>
+      <w:titlePg/>
       <w:docGrid w:linePitch="360"/>
     </w:sectPr>
   </w:body>
 </w:document>
+</file>
+
+<file path=word/endnotes.xml><?xml version="1.0" encoding="utf-8"?>
+<w:endnotes xmlns:wpc="http://schemas.microsoft.com/office/word/2010/wordprocessingCanvas" xmlns:cx="http://schemas.microsoft.com/office/drawing/2014/chartex" xmlns:cx1="http://schemas.microsoft.com/office/drawing/2015/9/8/chartex" xmlns:cx2="http://schemas.microsoft.com/office/drawing/2015/10/21/chartex" xmlns:cx3="http://schemas.microsoft.com/office/drawing/2016/5/9/chartex" xmlns:cx4="http://schemas.microsoft.com/office/drawing/2016/5/10/chartex" xmlns:cx5="http://schemas.microsoft.com/office/drawing/2016/5/11/chartex" xmlns:cx6="http://schemas.microsoft.com/office/drawing/2016/5/12/chartex" xmlns:cx7="http://schemas.microsoft.com/office/drawing/2016/5/13/chartex" xmlns:cx8="http://schemas.microsoft.com/office/drawing/2016/5/14/chartex" xmlns:mc="http://schemas.openxmlformats.org/markup-compatibility/2006" xmlns:aink="http://schemas.microsoft.com/office/drawing/2016/ink" xmlns:am3d="http://schemas.microsoft.com/office/drawing/2017/model3d" xmlns:o="urn:schemas-microsoft-com:office:office" xmlns:oel="http://schemas.microsoft.com/office/2019/extlst" xmlns:r="http://schemas.openxmlformats.org/officeDocument/2006/relationships" xmlns:m="http://schemas.openxmlformats.org/officeDocument/2006/math" xmlns:v="urn:schemas-microsoft-com:vml" xmlns:wp14="http://schemas.microsoft.com/office/word/2010/wordprocessingDrawing" xmlns:wp="http://schemas.openxmlformats.org/drawingml/2006/wordprocessingDrawing" xmlns:w10="urn:schemas-microsoft-com:office:word" xmlns:w="http://schemas.openxmlformats.org/wordprocessingml/2006/main" xmlns:w14="http://schemas.microsoft.com/office/word/2010/wordml" xmlns:w15="http://schemas.microsoft.com/office/word/2012/wordml" xmlns:w16cex="http://schemas.microsoft.com/office/word/2018/wordml/cex" xmlns:w16cid="http://schemas.microsoft.com/office/word/2016/wordml/cid" xmlns:w16="http://schemas.microsoft.com/office/word/2018/wordml" xmlns:w16du="http://schemas.microsoft.com/office/word/2023/wordml/word16du" xmlns:w16sdtdh="http://schemas.microsoft.com/office/word/2020/wordml/sdtdatahash" xmlns:w16sdtfl="http://schemas.microsoft.com/office/word/2024/wordml/sdtformatlock" xmlns:w16se="http://schemas.microsoft.com/office/word/2015/wordml/symex" xmlns:wpg="http://schemas.microsoft.com/office/word/2010/wordprocessingGroup" xmlns:wpi="http://schemas.microsoft.com/office/word/2010/wordprocessingInk" xmlns:wne="http://schemas.microsoft.com/office/word/2006/wordml" xmlns:wps="http://schemas.microsoft.com/office/word/2010/wordprocessingShape" mc:Ignorable="w14 w15 w16se w16cid w16 w16cex w16sdtdh w16sdtfl w16du wp14">
+  <w:endnote w:type="separator" w:id="-1">
+    <w:p>
+      <w:pPr>
+        <w:spacing w:after="0" w:line="240" w:lineRule="auto"/>
+      </w:pPr>
+      <w:r>
+        <w:separator/>
+      </w:r>
+    </w:p>
+  </w:endnote>
+  <w:endnote w:type="continuationSeparator" w:id="0">
+    <w:p>
+      <w:pPr>
+        <w:spacing w:after="0" w:line="240" w:lineRule="auto"/>
+      </w:pPr>
+      <w:r>
+        <w:continuationSeparator/>
+      </w:r>
+    </w:p>
+  </w:endnote>
+</w:endnotes>
+</file>
+
+<file path=word/footer1.xml><?xml version="1.0" encoding="utf-8"?>
+<w:ftr xmlns:wpc="http://schemas.microsoft.com/office/word/2010/wordprocessingCanvas" xmlns:cx="http://schemas.microsoft.com/office/drawing/2014/chartex" xmlns:cx1="http://schemas.microsoft.com/office/drawing/2015/9/8/chartex" xmlns:cx2="http://schemas.microsoft.com/office/drawing/2015/10/21/chartex" xmlns:cx3="http://schemas.microsoft.com/office/drawing/2016/5/9/chartex" xmlns:cx4="http://schemas.microsoft.com/office/drawing/2016/5/10/chartex" xmlns:cx5="http://schemas.microsoft.com/office/drawing/2016/5/11/chartex" xmlns:cx6="http://schemas.microsoft.com/office/drawing/2016/5/12/chartex" xmlns:cx7="http://schemas.microsoft.com/office/drawing/2016/5/13/chartex" xmlns:cx8="http://schemas.microsoft.com/office/drawing/2016/5/14/chartex" xmlns:mc="http://schemas.openxmlformats.org/markup-compatibility/2006" xmlns:aink="http://schemas.microsoft.com/office/drawing/2016/ink" xmlns:am3d="http://schemas.microsoft.com/office/drawing/2017/model3d" xmlns:o="urn:schemas-microsoft-com:office:office" xmlns:oel="http://schemas.microsoft.com/office/2019/extlst" xmlns:r="http://schemas.openxmlformats.org/officeDocument/2006/relationships" xmlns:m="http://schemas.openxmlformats.org/officeDocument/2006/math" xmlns:v="urn:schemas-microsoft-com:vml" xmlns:wp14="http://schemas.microsoft.com/office/word/2010/wordprocessingDrawing" xmlns:wp="http://schemas.openxmlformats.org/drawingml/2006/wordprocessingDrawing" xmlns:w10="urn:schemas-microsoft-com:office:word" xmlns:w="http://schemas.openxmlformats.org/wordprocessingml/2006/main" xmlns:w14="http://schemas.microsoft.com/office/word/2010/wordml" xmlns:w15="http://schemas.microsoft.com/office/word/2012/wordml" xmlns:w16cex="http://schemas.microsoft.com/office/word/2018/wordml/cex" xmlns:w16cid="http://schemas.microsoft.com/office/word/2016/wordml/cid" xmlns:w16="http://schemas.microsoft.com/office/word/2018/wordml" xmlns:w16du="http://schemas.microsoft.com/office/word/2023/wordml/word16du" xmlns:w16sdtdh="http://schemas.microsoft.com/office/word/2020/wordml/sdtdatahash" xmlns:w16sdtfl="http://schemas.microsoft.com/office/word/2024/wordml/sdtformatlock" xmlns:w16se="http://schemas.microsoft.com/office/word/2015/wordml/symex" xmlns:wpg="http://schemas.microsoft.com/office/word/2010/wordprocessingGroup" xmlns:wpi="http://schemas.microsoft.com/office/word/2010/wordprocessingInk" xmlns:wne="http://schemas.microsoft.com/office/word/2006/wordml" xmlns:wps="http://schemas.microsoft.com/office/word/2010/wordprocessingShape" mc:Ignorable="w14 w15 w16se w16cid w16 w16cex w16sdtdh w16sdtfl w16du wp14">
+  <w:sdt>
+    <w:sdtPr>
+      <w:rPr>
+        <w:sz w:val="24"/>
+        <w:szCs w:val="24"/>
+      </w:rPr>
+      <w:id w:val="541331446"/>
+      <w:docPartObj>
+        <w:docPartGallery w:val="Page Numbers (Bottom of Page)"/>
+        <w:docPartUnique/>
+      </w:docPartObj>
+    </w:sdtPr>
+    <w:sdtEndPr>
+      <w:rPr>
+        <w:color w:val="7F7F7F" w:themeColor="background1" w:themeShade="7F"/>
+        <w:spacing w:val="60"/>
+      </w:rPr>
+    </w:sdtEndPr>
+    <w:sdtContent>
+      <w:p>
+        <w:pPr>
+          <w:pStyle w:val="Footer"/>
+          <w:pBdr>
+            <w:top w:val="single" w:sz="4" w:space="1" w:color="D9D9D9" w:themeColor="background1" w:themeShade="D9"/>
+          </w:pBdr>
+          <w:jc w:val="right"/>
+          <w:rPr>
+            <w:sz w:val="24"/>
+            <w:szCs w:val="24"/>
+          </w:rPr>
+        </w:pPr>
+        <w:r>
+          <w:rPr>
+            <w:color w:val="000000" w:themeColor="text1"/>
+            <w:sz w:val="24"/>
+            <w:szCs w:val="24"/>
+          </w:rPr>
+          <w:fldChar w:fldCharType="begin"/>
+        </w:r>
+        <w:r>
+          <w:rPr>
+            <w:color w:val="000000" w:themeColor="text1"/>
+            <w:sz w:val="24"/>
+            <w:szCs w:val="24"/>
+          </w:rPr>
+          <w:instrText xml:space="preserve"> PAGE   \* MERGEFORMAT </w:instrText>
+        </w:r>
+        <w:r>
+          <w:rPr>
+            <w:color w:val="000000" w:themeColor="text1"/>
+            <w:sz w:val="24"/>
+            <w:szCs w:val="24"/>
+          </w:rPr>
+          <w:fldChar w:fldCharType="separate"/>
+        </w:r>
+        <w:r>
+          <w:rPr>
+            <w:noProof/>
+            <w:color w:val="000000" w:themeColor="text1"/>
+            <w:sz w:val="24"/>
+            <w:szCs w:val="24"/>
+          </w:rPr>
+          <w:t>2</w:t>
+        </w:r>
+        <w:r>
+          <w:rPr>
+            <w:noProof/>
+            <w:color w:val="000000" w:themeColor="text1"/>
+            <w:sz w:val="24"/>
+            <w:szCs w:val="24"/>
+          </w:rPr>
+          <w:fldChar w:fldCharType="end"/>
+        </w:r>
+        <w:r>
+          <w:rPr>
+            <w:color w:val="000000" w:themeColor="text1"/>
+            <w:sz w:val="24"/>
+            <w:szCs w:val="24"/>
+          </w:rPr>
+          <w:t xml:space="preserve"> | </w:t>
+        </w:r>
+        <w:r>
+          <w:rPr>
+            <w:color w:val="000000" w:themeColor="text1"/>
+            <w:spacing w:val="60"/>
+            <w:sz w:val="24"/>
+            <w:szCs w:val="24"/>
+          </w:rPr>
+          <w:t>Page</w:t>
+        </w:r>
+      </w:p>
+    </w:sdtContent>
+  </w:sdt>
+  <w:p>
+    <w:pPr>
+      <w:pStyle w:val="Footer"/>
+    </w:pPr>
+  </w:p>
+</w:ftr>
+</file>
+
+<file path=word/footnotes.xml><?xml version="1.0" encoding="utf-8"?>
+<w:footnotes xmlns:wpc="http://schemas.microsoft.com/office/word/2010/wordprocessingCanvas" xmlns:cx="http://schemas.microsoft.com/office/drawing/2014/chartex" xmlns:cx1="http://schemas.microsoft.com/office/drawing/2015/9/8/chartex" xmlns:cx2="http://schemas.microsoft.com/office/drawing/2015/10/21/chartex" xmlns:cx3="http://schemas.microsoft.com/office/drawing/2016/5/9/chartex" xmlns:cx4="http://schemas.microsoft.com/office/drawing/2016/5/10/chartex" xmlns:cx5="http://schemas.microsoft.com/office/drawing/2016/5/11/chartex" xmlns:cx6="http://schemas.microsoft.com/office/drawing/2016/5/12/chartex" xmlns:cx7="http://schemas.microsoft.com/office/drawing/2016/5/13/chartex" xmlns:cx8="http://schemas.microsoft.com/office/drawing/2016/5/14/chartex" xmlns:mc="http://schemas.openxmlformats.org/markup-compatibility/2006" xmlns:aink="http://schemas.microsoft.com/office/drawing/2016/ink" xmlns:am3d="http://schemas.microsoft.com/office/drawing/2017/model3d" xmlns:o="urn:schemas-microsoft-com:office:office" xmlns:oel="http://schemas.microsoft.com/office/2019/extlst" xmlns:r="http://schemas.openxmlformats.org/officeDocument/2006/relationships" xmlns:m="http://schemas.openxmlformats.org/officeDocument/2006/math" xmlns:v="urn:schemas-microsoft-com:vml" xmlns:wp14="http://schemas.microsoft.com/office/word/2010/wordprocessingDrawing" xmlns:wp="http://schemas.openxmlformats.org/drawingml/2006/wordprocessingDrawing" xmlns:w10="urn:schemas-microsoft-com:office:word" xmlns:w="http://schemas.openxmlformats.org/wordprocessingml/2006/main" xmlns:w14="http://schemas.microsoft.com/office/word/2010/wordml" xmlns:w15="http://schemas.microsoft.com/office/word/2012/wordml" xmlns:w16cex="http://schemas.microsoft.com/office/word/2018/wordml/cex" xmlns:w16cid="http://schemas.microsoft.com/office/word/2016/wordml/cid" xmlns:w16="http://schemas.microsoft.com/office/word/2018/wordml" xmlns:w16du="http://schemas.microsoft.com/office/word/2023/wordml/word16du" xmlns:w16sdtdh="http://schemas.microsoft.com/office/word/2020/wordml/sdtdatahash" xmlns:w16sdtfl="http://schemas.microsoft.com/office/word/2024/wordml/sdtformatlock" xmlns:w16se="http://schemas.microsoft.com/office/word/2015/wordml/symex" xmlns:wpg="http://schemas.microsoft.com/office/word/2010/wordprocessingGroup" xmlns:wpi="http://schemas.microsoft.com/office/word/2010/wordprocessingInk" xmlns:wne="http://schemas.microsoft.com/office/word/2006/wordml" xmlns:wps="http://schemas.microsoft.com/office/word/2010/wordprocessingShape" mc:Ignorable="w14 w15 w16se w16cid w16 w16cex w16sdtdh w16sdtfl w16du wp14">
+  <w:footnote w:type="separator" w:id="-1">
+    <w:p>
+      <w:pPr>
+        <w:spacing w:after="0" w:line="240" w:lineRule="auto"/>
+      </w:pPr>
+      <w:r>
+        <w:separator/>
+      </w:r>
+    </w:p>
+  </w:footnote>
+  <w:footnote w:type="continuationSeparator" w:id="0">
+    <w:p>
+      <w:pPr>
+        <w:spacing w:after="0" w:line="240" w:lineRule="auto"/>
+      </w:pPr>
+      <w:r>
+        <w:continuationSeparator/>
+      </w:r>
+    </w:p>
+  </w:footnote>
+</w:footnotes>
 </file>
 
 <file path=word/numbering.xml><?xml version="1.0" encoding="utf-8"?>
@@ -1201,6 +2737,7 @@
   </w:style>
   <w:style w:type="paragraph" w:styleId="NoSpacing">
     <w:name w:val="No Spacing"/>
+    <w:link w:val="NoSpacingChar"/>
     <w:uiPriority w:val="1"/>
     <w:qFormat/>
     <w:rsid w:val="00DC68BE"/>
@@ -1290,13 +2827,86 @@
     <w:basedOn w:val="Heading1"/>
     <w:next w:val="Normal"/>
     <w:uiPriority w:val="39"/>
-    <w:semiHidden/>
     <w:unhideWhenUsed/>
     <w:qFormat/>
     <w:rsid w:val="00DC68BE"/>
     <w:pPr>
       <w:outlineLvl w:val="9"/>
     </w:pPr>
+  </w:style>
+  <w:style w:type="character" w:customStyle="1" w:styleId="NoSpacingChar">
+    <w:name w:val="No Spacing Char"/>
+    <w:basedOn w:val="DefaultParagraphFont"/>
+    <w:link w:val="NoSpacing"/>
+    <w:uiPriority w:val="1"/>
+    <w:rsid w:val="00D07475"/>
+  </w:style>
+  <w:style w:type="paragraph" w:styleId="Header">
+    <w:name w:val="header"/>
+    <w:basedOn w:val="Normal"/>
+    <w:link w:val="HeaderChar"/>
+    <w:uiPriority w:val="99"/>
+    <w:unhideWhenUsed/>
+    <w:rsid w:val="002447EA"/>
+    <w:pPr>
+      <w:tabs>
+        <w:tab w:val="center" w:pos="4513"/>
+        <w:tab w:val="right" w:pos="9026"/>
+      </w:tabs>
+      <w:spacing w:after="0" w:line="240" w:lineRule="auto"/>
+    </w:pPr>
+  </w:style>
+  <w:style w:type="character" w:customStyle="1" w:styleId="HeaderChar">
+    <w:name w:val="Header Char"/>
+    <w:basedOn w:val="DefaultParagraphFont"/>
+    <w:link w:val="Header"/>
+    <w:uiPriority w:val="99"/>
+    <w:rsid w:val="002447EA"/>
+  </w:style>
+  <w:style w:type="paragraph" w:styleId="Footer">
+    <w:name w:val="footer"/>
+    <w:basedOn w:val="Normal"/>
+    <w:link w:val="FooterChar"/>
+    <w:uiPriority w:val="99"/>
+    <w:unhideWhenUsed/>
+    <w:rsid w:val="002447EA"/>
+    <w:pPr>
+      <w:tabs>
+        <w:tab w:val="center" w:pos="4513"/>
+        <w:tab w:val="right" w:pos="9026"/>
+      </w:tabs>
+      <w:spacing w:after="0" w:line="240" w:lineRule="auto"/>
+    </w:pPr>
+  </w:style>
+  <w:style w:type="character" w:customStyle="1" w:styleId="FooterChar">
+    <w:name w:val="Footer Char"/>
+    <w:basedOn w:val="DefaultParagraphFont"/>
+    <w:link w:val="Footer"/>
+    <w:uiPriority w:val="99"/>
+    <w:rsid w:val="002447EA"/>
+  </w:style>
+  <w:style w:type="paragraph" w:styleId="TOC1">
+    <w:name w:val="toc 1"/>
+    <w:basedOn w:val="Normal"/>
+    <w:next w:val="Normal"/>
+    <w:autoRedefine/>
+    <w:uiPriority w:val="39"/>
+    <w:unhideWhenUsed/>
+    <w:rsid w:val="0036399C"/>
+    <w:pPr>
+      <w:spacing w:after="100"/>
+    </w:pPr>
+  </w:style>
+  <w:style w:type="character" w:styleId="Hyperlink">
+    <w:name w:val="Hyperlink"/>
+    <w:basedOn w:val="DefaultParagraphFont"/>
+    <w:uiPriority w:val="99"/>
+    <w:unhideWhenUsed/>
+    <w:rsid w:val="0036399C"/>
+    <w:rPr>
+      <w:color w:val="6B9F25" w:themeColor="hyperlink"/>
+      <w:u w:val="single"/>
+    </w:rPr>
   </w:style>
 </w:styles>
 </file>

</xml_diff>

<commit_message>
docs: added subheadings to each heading and rough outline of what to write in each section
</commit_message>
<xml_diff>
--- a/Documents/Report (Number_Guessing_Game).docx
+++ b/Documents/Report (Number_Guessing_Game).docx
@@ -862,8 +862,15 @@
         </w:p>
       </w:sdtContent>
     </w:sdt>
+    <w:bookmarkStart w:id="0" w:name="_Toc207984774" w:displacedByCustomXml="next"/>
     <w:sdt>
       <w:sdtPr>
+        <w:rPr>
+          <w:rFonts w:asciiTheme="minorHAnsi" w:eastAsiaTheme="minorEastAsia" w:hAnsiTheme="minorHAnsi" w:cstheme="minorBidi"/>
+          <w:color w:val="auto"/>
+          <w:sz w:val="21"/>
+          <w:szCs w:val="21"/>
+        </w:rPr>
         <w:id w:val="327105397"/>
         <w:docPartObj>
           <w:docPartGallery w:val="Table of Contents"/>
@@ -872,13 +879,9 @@
       </w:sdtPr>
       <w:sdtEndPr>
         <w:rPr>
-          <w:rFonts w:asciiTheme="minorHAnsi" w:eastAsiaTheme="minorEastAsia" w:hAnsiTheme="minorHAnsi" w:cstheme="minorBidi"/>
           <w:b/>
           <w:bCs/>
           <w:noProof/>
-          <w:color w:val="auto"/>
-          <w:sz w:val="21"/>
-          <w:szCs w:val="21"/>
         </w:rPr>
       </w:sdtEndPr>
       <w:sdtContent>
@@ -889,6 +892,7 @@
           <w:r>
             <w:t>Table of Contents</w:t>
           </w:r>
+          <w:bookmarkEnd w:id="0"/>
         </w:p>
         <w:p>
           <w:pPr>
@@ -898,6 +902,11 @@
             </w:tabs>
             <w:rPr>
               <w:noProof/>
+              <w:kern w:val="2"/>
+              <w:sz w:val="24"/>
+              <w:szCs w:val="24"/>
+              <w:lang w:eastAsia="en-GB"/>
+              <w14:ligatures w14:val="standardContextual"/>
             </w:rPr>
           </w:pPr>
           <w:r>
@@ -909,13 +918,13 @@
           <w:r>
             <w:fldChar w:fldCharType="separate"/>
           </w:r>
-          <w:hyperlink w:anchor="_Toc206632508" w:history="1">
+          <w:hyperlink w:anchor="_Toc207984774" w:history="1">
             <w:r>
               <w:rPr>
                 <w:rStyle w:val="Hyperlink"/>
                 <w:noProof/>
               </w:rPr>
-              <w:t>Index</w:t>
+              <w:t>Table of Contents</w:t>
             </w:r>
             <w:r>
               <w:rPr>
@@ -936,7 +945,7 @@
                 <w:noProof/>
                 <w:webHidden/>
               </w:rPr>
-              <w:instrText xml:space="preserve"> PAGEREF _Toc206632508 \h </w:instrText>
+              <w:instrText xml:space="preserve"> PAGEREF _Toc207984774 \h </w:instrText>
             </w:r>
             <w:r>
               <w:rPr>
@@ -975,9 +984,14 @@
             </w:tabs>
             <w:rPr>
               <w:noProof/>
+              <w:kern w:val="2"/>
+              <w:sz w:val="24"/>
+              <w:szCs w:val="24"/>
+              <w:lang w:eastAsia="en-GB"/>
+              <w14:ligatures w14:val="standardContextual"/>
             </w:rPr>
           </w:pPr>
-          <w:hyperlink w:anchor="_Toc206632509" w:history="1">
+          <w:hyperlink w:anchor="_Toc207984775" w:history="1">
             <w:r>
               <w:rPr>
                 <w:rStyle w:val="Hyperlink"/>
@@ -1004,7 +1018,7 @@
                 <w:noProof/>
                 <w:webHidden/>
               </w:rPr>
-              <w:instrText xml:space="preserve"> PAGEREF _Toc206632509 \h </w:instrText>
+              <w:instrText xml:space="preserve"> PAGEREF _Toc207984775 \h </w:instrText>
             </w:r>
             <w:r>
               <w:rPr>
@@ -1043,9 +1057,14 @@
             </w:tabs>
             <w:rPr>
               <w:noProof/>
+              <w:kern w:val="2"/>
+              <w:sz w:val="24"/>
+              <w:szCs w:val="24"/>
+              <w:lang w:eastAsia="en-GB"/>
+              <w14:ligatures w14:val="standardContextual"/>
             </w:rPr>
           </w:pPr>
-          <w:hyperlink w:anchor="_Toc206632510" w:history="1">
+          <w:hyperlink w:anchor="_Toc207984776" w:history="1">
             <w:r>
               <w:rPr>
                 <w:rStyle w:val="Hyperlink"/>
@@ -1072,7 +1091,7 @@
                 <w:noProof/>
                 <w:webHidden/>
               </w:rPr>
-              <w:instrText xml:space="preserve"> PAGEREF _Toc206632510 \h </w:instrText>
+              <w:instrText xml:space="preserve"> PAGEREF _Toc207984776 \h </w:instrText>
             </w:r>
             <w:r>
               <w:rPr>
@@ -1111,15 +1130,20 @@
             </w:tabs>
             <w:rPr>
               <w:noProof/>
+              <w:kern w:val="2"/>
+              <w:sz w:val="24"/>
+              <w:szCs w:val="24"/>
+              <w:lang w:eastAsia="en-GB"/>
+              <w14:ligatures w14:val="standardContextual"/>
             </w:rPr>
           </w:pPr>
-          <w:hyperlink w:anchor="_Toc206632511" w:history="1">
+          <w:hyperlink w:anchor="_Toc207984777" w:history="1">
             <w:r>
               <w:rPr>
                 <w:rStyle w:val="Hyperlink"/>
                 <w:noProof/>
               </w:rPr>
-              <w:t>Initial Requirements</w:t>
+              <w:t>Planning and Design</w:t>
             </w:r>
             <w:r>
               <w:rPr>
@@ -1140,7 +1164,7 @@
                 <w:noProof/>
                 <w:webHidden/>
               </w:rPr>
-              <w:instrText xml:space="preserve"> PAGEREF _Toc206632511 \h </w:instrText>
+              <w:instrText xml:space="preserve"> PAGEREF _Toc207984777 \h </w:instrText>
             </w:r>
             <w:r>
               <w:rPr>
@@ -1179,15 +1203,20 @@
             </w:tabs>
             <w:rPr>
               <w:noProof/>
+              <w:kern w:val="2"/>
+              <w:sz w:val="24"/>
+              <w:szCs w:val="24"/>
+              <w:lang w:eastAsia="en-GB"/>
+              <w14:ligatures w14:val="standardContextual"/>
             </w:rPr>
           </w:pPr>
-          <w:hyperlink w:anchor="_Toc206632512" w:history="1">
+          <w:hyperlink w:anchor="_Toc207984778" w:history="1">
             <w:r>
               <w:rPr>
                 <w:rStyle w:val="Hyperlink"/>
                 <w:noProof/>
               </w:rPr>
-              <w:t>Further Developments</w:t>
+              <w:t>Initial Requirements</w:t>
             </w:r>
             <w:r>
               <w:rPr>
@@ -1208,7 +1237,7 @@
                 <w:noProof/>
                 <w:webHidden/>
               </w:rPr>
-              <w:instrText xml:space="preserve"> PAGEREF _Toc206632512 \h </w:instrText>
+              <w:instrText xml:space="preserve"> PAGEREF _Toc207984778 \h </w:instrText>
             </w:r>
             <w:r>
               <w:rPr>
@@ -1247,15 +1276,20 @@
             </w:tabs>
             <w:rPr>
               <w:noProof/>
+              <w:kern w:val="2"/>
+              <w:sz w:val="24"/>
+              <w:szCs w:val="24"/>
+              <w:lang w:eastAsia="en-GB"/>
+              <w14:ligatures w14:val="standardContextual"/>
             </w:rPr>
           </w:pPr>
-          <w:hyperlink w:anchor="_Toc206632513" w:history="1">
+          <w:hyperlink w:anchor="_Toc207984779" w:history="1">
             <w:r>
               <w:rPr>
                 <w:rStyle w:val="Hyperlink"/>
                 <w:noProof/>
               </w:rPr>
-              <w:t>Reflections</w:t>
+              <w:t>Further Developments</w:t>
             </w:r>
             <w:r>
               <w:rPr>
@@ -1276,7 +1310,7 @@
                 <w:noProof/>
                 <w:webHidden/>
               </w:rPr>
-              <w:instrText xml:space="preserve"> PAGEREF _Toc206632513 \h </w:instrText>
+              <w:instrText xml:space="preserve"> PAGEREF _Toc207984779 \h </w:instrText>
             </w:r>
             <w:r>
               <w:rPr>
@@ -1315,14 +1349,92 @@
             </w:tabs>
             <w:rPr>
               <w:noProof/>
+              <w:kern w:val="2"/>
+              <w:sz w:val="24"/>
+              <w:szCs w:val="24"/>
+              <w:lang w:eastAsia="en-GB"/>
+              <w14:ligatures w14:val="standardContextual"/>
             </w:rPr>
           </w:pPr>
-          <w:hyperlink w:anchor="_Toc206632514" w:history="1">
+          <w:hyperlink w:anchor="_Toc207984780" w:history="1">
             <w:r>
               <w:rPr>
                 <w:rStyle w:val="Hyperlink"/>
                 <w:noProof/>
               </w:rPr>
+              <w:t>Reflections</w:t>
+            </w:r>
+            <w:r>
+              <w:rPr>
+                <w:noProof/>
+                <w:webHidden/>
+              </w:rPr>
+              <w:tab/>
+            </w:r>
+            <w:r>
+              <w:rPr>
+                <w:noProof/>
+                <w:webHidden/>
+              </w:rPr>
+              <w:fldChar w:fldCharType="begin"/>
+            </w:r>
+            <w:r>
+              <w:rPr>
+                <w:noProof/>
+                <w:webHidden/>
+              </w:rPr>
+              <w:instrText xml:space="preserve"> PAGEREF _Toc207984780 \h </w:instrText>
+            </w:r>
+            <w:r>
+              <w:rPr>
+                <w:noProof/>
+                <w:webHidden/>
+              </w:rPr>
+            </w:r>
+            <w:r>
+              <w:rPr>
+                <w:noProof/>
+                <w:webHidden/>
+              </w:rPr>
+              <w:fldChar w:fldCharType="separate"/>
+            </w:r>
+            <w:r>
+              <w:rPr>
+                <w:noProof/>
+                <w:webHidden/>
+              </w:rPr>
+              <w:t>2</w:t>
+            </w:r>
+            <w:r>
+              <w:rPr>
+                <w:noProof/>
+                <w:webHidden/>
+              </w:rPr>
+              <w:fldChar w:fldCharType="end"/>
+            </w:r>
+          </w:hyperlink>
+        </w:p>
+        <w:p>
+          <w:pPr>
+            <w:pStyle w:val="TOC1"/>
+            <w:tabs>
+              <w:tab w:val="right" w:leader="dot" w:pos="9016"/>
+            </w:tabs>
+            <w:rPr>
+              <w:noProof/>
+              <w:kern w:val="2"/>
+              <w:sz w:val="24"/>
+              <w:szCs w:val="24"/>
+              <w:lang w:eastAsia="en-GB"/>
+              <w14:ligatures w14:val="standardContextual"/>
+            </w:rPr>
+          </w:pPr>
+          <w:hyperlink w:anchor="_Toc207984781" w:history="1">
+            <w:r>
+              <w:rPr>
+                <w:rStyle w:val="Hyperlink"/>
+                <w:noProof/>
+              </w:rPr>
               <w:t>Conclusion</w:t>
             </w:r>
             <w:r>
@@ -1344,7 +1456,7 @@
                 <w:noProof/>
                 <w:webHidden/>
               </w:rPr>
-              <w:instrText xml:space="preserve"> PAGEREF _Toc206632514 \h </w:instrText>
+              <w:instrText xml:space="preserve"> PAGEREF _Toc207984781 \h </w:instrText>
             </w:r>
             <w:r>
               <w:rPr>
@@ -1412,47 +1524,386 @@
     <w:p/>
     <w:p/>
     <w:p/>
-    <w:p/>
     <w:p>
       <w:pPr>
         <w:pStyle w:val="Heading1"/>
       </w:pPr>
-      <w:bookmarkStart w:id="0" w:name="_Toc206632509"/>
+      <w:bookmarkStart w:id="1" w:name="_Toc207984775"/>
       <w:r>
         <w:lastRenderedPageBreak/>
         <w:t>Introduction</w:t>
       </w:r>
-      <w:bookmarkEnd w:id="0"/>
-    </w:p>
-    <w:p/>
-    <w:p/>
+      <w:bookmarkEnd w:id="1"/>
+    </w:p>
+    <w:p/>
+    <w:p>
+      <w:pPr>
+        <w:pStyle w:val="Heading2"/>
+        <w:ind w:firstLine="720"/>
+      </w:pPr>
+      <w:r>
+        <w:t>Purpose of the Project</w:t>
+      </w:r>
+    </w:p>
+    <w:p>
+      <w:r>
+        <w:t>The purpose of this project is to add to my portfolio a project that demonstrates my technical capabilities and to practice building good coding habits.</w:t>
+      </w:r>
+    </w:p>
+    <w:p/>
+    <w:p>
+      <w:pPr>
+        <w:pStyle w:val="Heading2"/>
+        <w:ind w:firstLine="720"/>
+      </w:pPr>
+      <w:r>
+        <w:t>Project Scope</w:t>
+      </w:r>
+    </w:p>
+    <w:p>
+      <w:r>
+        <w:t xml:space="preserve">The final product of this project will be a finished application. The purpose of this report is to document the </w:t>
+      </w:r>
+      <w:r>
+        <w:t xml:space="preserve">phases of the project. From the </w:t>
+      </w:r>
+      <w:r>
+        <w:t xml:space="preserve">planning phase, showing the initial requirements and design and later developing into the further features such as GUI and level design. </w:t>
+      </w:r>
+      <w:r>
+        <w:t xml:space="preserve">This report will also contain some reflections at the end to show what skills I have developed and what lessons I have learned that I will take with me to my next project. </w:t>
+      </w:r>
+    </w:p>
     <w:p/>
     <w:p>
       <w:pPr>
         <w:pStyle w:val="Heading1"/>
       </w:pPr>
-      <w:bookmarkStart w:id="1" w:name="_Toc206632510"/>
+      <w:bookmarkStart w:id="2" w:name="_Toc207984776"/>
       <w:r>
         <w:t>Project Overview</w:t>
       </w:r>
-      <w:bookmarkEnd w:id="1"/>
+      <w:bookmarkEnd w:id="2"/>
       <w:r>
         <w:t xml:space="preserve"> </w:t>
       </w:r>
     </w:p>
     <w:p/>
+    <w:p>
+      <w:pPr>
+        <w:pStyle w:val="Heading2"/>
+        <w:ind w:firstLine="720"/>
+      </w:pPr>
+      <w:r>
+        <w:t>Project Description</w:t>
+      </w:r>
+    </w:p>
+    <w:p>
+      <w:r>
+        <w:t>Short explanation of what the game does and how it works.</w:t>
+      </w:r>
+      <w:r>
+        <w:t xml:space="preserve"> </w:t>
+      </w:r>
+    </w:p>
+    <w:p>
+      <w:r>
+        <w:t>Who the intended user is (beginner player, casual user).</w:t>
+      </w:r>
+    </w:p>
+    <w:p/>
+    <w:p>
+      <w:pPr>
+        <w:pStyle w:val="Heading2"/>
+        <w:ind w:firstLine="720"/>
+      </w:pPr>
+      <w:r>
+        <w:t>Technical Setup</w:t>
+      </w:r>
+    </w:p>
+    <w:p>
+      <w:r>
+        <w:t>Tools and technologies used (Java, Maven, Docker, GitHub</w:t>
+      </w:r>
+      <w:r>
+        <w:t>, J</w:t>
+      </w:r>
+      <w:r>
+        <w:t>U</w:t>
+      </w:r>
+      <w:r>
+        <w:t>nit5</w:t>
+      </w:r>
+      <w:r>
+        <w:t>).</w:t>
+      </w:r>
+    </w:p>
+    <w:p>
+      <w:r>
+        <w:t>Development environment setup.</w:t>
+      </w:r>
+      <w:r>
+        <w:t xml:space="preserve"> Talk about Docker and eventually JavaFX</w:t>
+      </w:r>
+    </w:p>
+    <w:p/>
+    <w:p>
+      <w:pPr>
+        <w:pStyle w:val="Heading2"/>
+        <w:ind w:firstLine="720"/>
+      </w:pPr>
+      <w:r>
+        <w:t>Design and Architecture</w:t>
+      </w:r>
+    </w:p>
+    <w:p>
+      <w:r>
+        <w:t>[include a UML diagram of the final code</w:t>
+      </w:r>
+      <w:r>
+        <w:t xml:space="preserve"> (after the initial features are finished and after the further developments are complete)</w:t>
+      </w:r>
+      <w:r>
+        <w:t>]</w:t>
+      </w:r>
+    </w:p>
+    <w:p/>
+    <w:p/>
+    <w:p/>
+    <w:p/>
+    <w:p/>
     <w:p/>
     <w:p/>
     <w:p>
       <w:pPr>
         <w:pStyle w:val="Heading1"/>
       </w:pPr>
-      <w:bookmarkStart w:id="2" w:name="_Toc206632511"/>
+      <w:bookmarkStart w:id="3" w:name="_Toc207984777"/>
+      <w:r>
+        <w:lastRenderedPageBreak/>
+        <w:t>Planning</w:t>
+      </w:r>
+      <w:r>
+        <w:t xml:space="preserve"> and Design</w:t>
+      </w:r>
+      <w:bookmarkEnd w:id="3"/>
+    </w:p>
+    <w:p/>
+    <w:p>
+      <w:pPr>
+        <w:pStyle w:val="Heading2"/>
+        <w:ind w:firstLine="720"/>
+      </w:pPr>
+      <w:r>
+        <w:t xml:space="preserve">Initial Concept </w:t>
+      </w:r>
+    </w:p>
+    <w:p>
+      <w:r>
+        <w:t xml:space="preserve">How </w:t>
+      </w:r>
+      <w:r>
+        <w:t>I</w:t>
+      </w:r>
+      <w:r>
+        <w:t xml:space="preserve"> imagined the project at the start.</w:t>
+      </w:r>
+    </w:p>
+    <w:p>
+      <w:r>
+        <w:t>Inspiration or examples looked at.</w:t>
+      </w:r>
+    </w:p>
+    <w:p/>
+    <w:p>
+      <w:pPr>
+        <w:pStyle w:val="Heading2"/>
+        <w:ind w:firstLine="720"/>
+      </w:pPr>
+      <w:r>
+        <w:t>Design Choices</w:t>
+      </w:r>
+    </w:p>
+    <w:p>
+      <w:r>
+        <w:t xml:space="preserve">Justifications for </w:t>
+      </w:r>
+      <w:r>
+        <w:t xml:space="preserve">game </w:t>
+      </w:r>
+      <w:r>
+        <w:t>structure.</w:t>
+      </w:r>
+    </w:p>
+    <w:p>
+      <w:r>
+        <w:t>Any patterns or principles followed (simplicity, readability).</w:t>
+      </w:r>
+    </w:p>
+    <w:p/>
+    <w:p>
+      <w:pPr>
+        <w:pStyle w:val="Heading2"/>
+        <w:ind w:firstLine="720"/>
+      </w:pPr>
+      <w:r>
+        <w:t xml:space="preserve">User Interaction </w:t>
+      </w:r>
+    </w:p>
+    <w:p>
+      <w:r>
+        <w:t>Considerations for user experience (clear prompts, validation).</w:t>
+      </w:r>
+    </w:p>
+    <w:p>
+      <w:pPr>
+        <w:pStyle w:val="Heading1"/>
+      </w:pPr>
+      <w:bookmarkStart w:id="4" w:name="_Toc207984778"/>
       <w:r>
         <w:t>Initial Requirements</w:t>
       </w:r>
-      <w:bookmarkEnd w:id="2"/>
-    </w:p>
+      <w:bookmarkEnd w:id="4"/>
+    </w:p>
+    <w:p/>
+    <w:p>
+      <w:pPr>
+        <w:pStyle w:val="Heading2"/>
+        <w:ind w:firstLine="720"/>
+      </w:pPr>
+      <w:r>
+        <w:t>Core Features</w:t>
+      </w:r>
+    </w:p>
+    <w:p>
+      <w:pPr>
+        <w:pStyle w:val="ListParagraph"/>
+        <w:numPr>
+          <w:ilvl w:val="0"/>
+          <w:numId w:val="2"/>
+        </w:numPr>
+      </w:pPr>
+      <w:r>
+        <w:t>The computer chooses a random number between 1 and 100.</w:t>
+      </w:r>
+    </w:p>
+    <w:p>
+      <w:pPr>
+        <w:numPr>
+          <w:ilvl w:val="0"/>
+          <w:numId w:val="2"/>
+        </w:numPr>
+      </w:pPr>
+      <w:r>
+        <w:t>The user inputs a guess.</w:t>
+      </w:r>
+    </w:p>
+    <w:p>
+      <w:pPr>
+        <w:numPr>
+          <w:ilvl w:val="0"/>
+          <w:numId w:val="2"/>
+        </w:numPr>
+      </w:pPr>
+      <w:r>
+        <w:t>The game tells the user if the guess is:</w:t>
+      </w:r>
+    </w:p>
+    <w:p>
+      <w:pPr>
+        <w:numPr>
+          <w:ilvl w:val="0"/>
+          <w:numId w:val="3"/>
+        </w:numPr>
+        <w:tabs>
+          <w:tab w:val="num" w:pos="720"/>
+        </w:tabs>
+      </w:pPr>
+      <w:r>
+        <w:t>Too high</w:t>
+      </w:r>
+    </w:p>
+    <w:p>
+      <w:pPr>
+        <w:numPr>
+          <w:ilvl w:val="0"/>
+          <w:numId w:val="3"/>
+        </w:numPr>
+        <w:tabs>
+          <w:tab w:val="num" w:pos="720"/>
+        </w:tabs>
+      </w:pPr>
+      <w:r>
+        <w:t>Too low</w:t>
+      </w:r>
+    </w:p>
+    <w:p>
+      <w:pPr>
+        <w:numPr>
+          <w:ilvl w:val="0"/>
+          <w:numId w:val="3"/>
+        </w:numPr>
+        <w:tabs>
+          <w:tab w:val="num" w:pos="720"/>
+        </w:tabs>
+      </w:pPr>
+      <w:r>
+        <w:t>Correct</w:t>
+      </w:r>
+    </w:p>
+    <w:p>
+      <w:pPr>
+        <w:numPr>
+          <w:ilvl w:val="0"/>
+          <w:numId w:val="4"/>
+        </w:numPr>
+      </w:pPr>
+      <w:r>
+        <w:t>Tracks the number of attempts.</w:t>
+      </w:r>
+    </w:p>
+    <w:p>
+      <w:pPr>
+        <w:numPr>
+          <w:ilvl w:val="0"/>
+          <w:numId w:val="4"/>
+        </w:numPr>
+      </w:pPr>
+      <w:r>
+        <w:t>Offers a “Play again?” option when the game ends.</w:t>
+      </w:r>
+    </w:p>
+    <w:p/>
+    <w:p>
+      <w:pPr>
+        <w:pStyle w:val="Heading2"/>
+        <w:ind w:firstLine="720"/>
+      </w:pPr>
+      <w:r>
+        <w:t>Constraints and Goals</w:t>
+      </w:r>
+    </w:p>
+    <w:p>
+      <w:r>
+        <w:t>Requirements set</w:t>
+      </w:r>
+      <w:r>
+        <w:t>.</w:t>
+      </w:r>
+    </w:p>
+    <w:p>
+      <w:r>
+        <w:t xml:space="preserve">What to achieve within </w:t>
+      </w:r>
+      <w:r>
+        <w:t>the</w:t>
+      </w:r>
+      <w:r>
+        <w:t xml:space="preserve"> timeframe.</w:t>
+      </w:r>
+    </w:p>
+    <w:p/>
+    <w:p/>
     <w:p/>
     <w:p/>
     <w:p/>
@@ -1460,37 +1911,143 @@
       <w:pPr>
         <w:pStyle w:val="Heading1"/>
       </w:pPr>
-      <w:bookmarkStart w:id="3" w:name="_Toc206632512"/>
-      <w:r>
+      <w:bookmarkStart w:id="5" w:name="_Toc207984779"/>
+      <w:r>
+        <w:lastRenderedPageBreak/>
         <w:t>Further Developments</w:t>
       </w:r>
-      <w:bookmarkEnd w:id="3"/>
-    </w:p>
-    <w:p/>
-    <w:p/>
+      <w:bookmarkEnd w:id="5"/>
+    </w:p>
+    <w:p/>
+    <w:p>
+      <w:pPr>
+        <w:pStyle w:val="Heading2"/>
+        <w:ind w:firstLine="720"/>
+      </w:pPr>
+      <w:bookmarkStart w:id="6" w:name="_Toc207984780"/>
+      <w:r>
+        <w:t>Features</w:t>
+      </w:r>
+    </w:p>
+    <w:p>
+      <w:pPr>
+        <w:numPr>
+          <w:ilvl w:val="0"/>
+          <w:numId w:val="5"/>
+        </w:numPr>
+      </w:pPr>
+      <w:r>
+        <w:t>I</w:t>
+      </w:r>
+      <w:r>
+        <w:t>nput validation (prevent strings or out-of-range numbers).</w:t>
+      </w:r>
+    </w:p>
+    <w:p>
+      <w:pPr>
+        <w:numPr>
+          <w:ilvl w:val="0"/>
+          <w:numId w:val="5"/>
+        </w:numPr>
+      </w:pPr>
+      <w:r>
+        <w:t>Difficulty levels (Easy: 1–10, Medium: 1–100, Hard: 1–1000).</w:t>
+      </w:r>
+    </w:p>
+    <w:p>
+      <w:pPr>
+        <w:numPr>
+          <w:ilvl w:val="0"/>
+          <w:numId w:val="5"/>
+        </w:numPr>
+      </w:pPr>
+      <w:r>
+        <w:t>Guess history (show previous guesses).</w:t>
+      </w:r>
+    </w:p>
+    <w:p>
+      <w:pPr>
+        <w:numPr>
+          <w:ilvl w:val="0"/>
+          <w:numId w:val="5"/>
+        </w:numPr>
+      </w:pPr>
+      <w:r>
+        <w:t>Timed mode (guess within a time limit).</w:t>
+      </w:r>
+    </w:p>
+    <w:p>
+      <w:pPr>
+        <w:numPr>
+          <w:ilvl w:val="0"/>
+          <w:numId w:val="5"/>
+        </w:numPr>
+      </w:pPr>
+      <w:r>
+        <w:t>Leaderboard (best scores stored in local storage or a file).</w:t>
+      </w:r>
+    </w:p>
+    <w:p>
+      <w:pPr>
+        <w:numPr>
+          <w:ilvl w:val="0"/>
+          <w:numId w:val="5"/>
+        </w:numPr>
+      </w:pPr>
+      <w:r>
+        <w:t>GUI version.</w:t>
+      </w:r>
+    </w:p>
     <w:p/>
     <w:p>
       <w:pPr>
         <w:pStyle w:val="Heading1"/>
       </w:pPr>
-      <w:bookmarkStart w:id="4" w:name="_Toc206632513"/>
       <w:r>
         <w:t>Reflections</w:t>
       </w:r>
-      <w:bookmarkEnd w:id="4"/>
-    </w:p>
-    <w:p/>
-    <w:p/>
+      <w:bookmarkEnd w:id="6"/>
+    </w:p>
+    <w:p/>
+    <w:p>
+      <w:pPr>
+        <w:pStyle w:val="Heading2"/>
+        <w:ind w:firstLine="720"/>
+      </w:pPr>
+      <w:r>
+        <w:t>Challenges Faced</w:t>
+      </w:r>
+    </w:p>
+    <w:p/>
+    <w:p>
+      <w:pPr>
+        <w:pStyle w:val="Heading2"/>
+        <w:ind w:firstLine="720"/>
+      </w:pPr>
+      <w:r>
+        <w:t>Skills Learned</w:t>
+      </w:r>
+    </w:p>
+    <w:p/>
+    <w:p>
+      <w:pPr>
+        <w:pStyle w:val="Heading2"/>
+        <w:ind w:firstLine="720"/>
+      </w:pPr>
+      <w:r>
+        <w:t>What Could Be Improved</w:t>
+      </w:r>
+    </w:p>
     <w:p/>
     <w:p>
       <w:pPr>
         <w:pStyle w:val="Heading1"/>
       </w:pPr>
-      <w:bookmarkStart w:id="5" w:name="_Toc206632514"/>
+      <w:bookmarkStart w:id="7" w:name="_Toc207984781"/>
       <w:r>
         <w:t>Conclusion</w:t>
       </w:r>
-      <w:bookmarkEnd w:id="5"/>
+      <w:bookmarkEnd w:id="7"/>
     </w:p>
     <w:sectPr>
       <w:footerReference w:type="default" r:id="rId7"/>
@@ -1661,6 +2218,420 @@
 <file path=word/numbering.xml><?xml version="1.0" encoding="utf-8"?>
 <w:numbering xmlns:wpc="http://schemas.microsoft.com/office/word/2010/wordprocessingCanvas" xmlns:cx="http://schemas.microsoft.com/office/drawing/2014/chartex" xmlns:cx1="http://schemas.microsoft.com/office/drawing/2015/9/8/chartex" xmlns:cx2="http://schemas.microsoft.com/office/drawing/2015/10/21/chartex" xmlns:cx3="http://schemas.microsoft.com/office/drawing/2016/5/9/chartex" xmlns:cx4="http://schemas.microsoft.com/office/drawing/2016/5/10/chartex" xmlns:cx5="http://schemas.microsoft.com/office/drawing/2016/5/11/chartex" xmlns:cx6="http://schemas.microsoft.com/office/drawing/2016/5/12/chartex" xmlns:cx7="http://schemas.microsoft.com/office/drawing/2016/5/13/chartex" xmlns:cx8="http://schemas.microsoft.com/office/drawing/2016/5/14/chartex" xmlns:mc="http://schemas.openxmlformats.org/markup-compatibility/2006" xmlns:aink="http://schemas.microsoft.com/office/drawing/2016/ink" xmlns:am3d="http://schemas.microsoft.com/office/drawing/2017/model3d" xmlns:o="urn:schemas-microsoft-com:office:office" xmlns:oel="http://schemas.microsoft.com/office/2019/extlst" xmlns:r="http://schemas.openxmlformats.org/officeDocument/2006/relationships" xmlns:m="http://schemas.openxmlformats.org/officeDocument/2006/math" xmlns:v="urn:schemas-microsoft-com:vml" xmlns:wp14="http://schemas.microsoft.com/office/word/2010/wordprocessingDrawing" xmlns:wp="http://schemas.openxmlformats.org/drawingml/2006/wordprocessingDrawing" xmlns:w10="urn:schemas-microsoft-com:office:word" xmlns:w="http://schemas.openxmlformats.org/wordprocessingml/2006/main" xmlns:w14="http://schemas.microsoft.com/office/word/2010/wordml" xmlns:w15="http://schemas.microsoft.com/office/word/2012/wordml" xmlns:w16cex="http://schemas.microsoft.com/office/word/2018/wordml/cex" xmlns:w16cid="http://schemas.microsoft.com/office/word/2016/wordml/cid" xmlns:w16="http://schemas.microsoft.com/office/word/2018/wordml" xmlns:w16du="http://schemas.microsoft.com/office/word/2023/wordml/word16du" xmlns:w16sdtdh="http://schemas.microsoft.com/office/word/2020/wordml/sdtdatahash" xmlns:w16sdtfl="http://schemas.microsoft.com/office/word/2024/wordml/sdtformatlock" xmlns:w16se="http://schemas.microsoft.com/office/word/2015/wordml/symex" xmlns:wpg="http://schemas.microsoft.com/office/word/2010/wordprocessingGroup" xmlns:wpi="http://schemas.microsoft.com/office/word/2010/wordprocessingInk" xmlns:wne="http://schemas.microsoft.com/office/word/2006/wordml" xmlns:wps="http://schemas.microsoft.com/office/word/2010/wordprocessingShape" mc:Ignorable="w14 w15 w16se w16cid w16 w16cex w16sdtdh w16sdtfl w16du wp14">
   <w:abstractNum w:abstractNumId="0" w15:restartNumberingAfterBreak="0">
+    <w:nsid w:val="0B236539"/>
+    <w:multiLevelType w:val="multilevel"/>
+    <w:tmpl w:val="F67EEAA2"/>
+    <w:lvl w:ilvl="0">
+      <w:start w:val="1"/>
+      <w:numFmt w:val="bullet"/>
+      <w:lvlText w:val=""/>
+      <w:lvlJc w:val="left"/>
+      <w:pPr>
+        <w:tabs>
+          <w:tab w:val="num" w:pos="720"/>
+        </w:tabs>
+        <w:ind w:left="720" w:hanging="360"/>
+      </w:pPr>
+      <w:rPr>
+        <w:rFonts w:ascii="Symbol" w:hAnsi="Symbol" w:hint="default"/>
+        <w:sz w:val="20"/>
+      </w:rPr>
+    </w:lvl>
+    <w:lvl w:ilvl="1" w:tentative="1">
+      <w:start w:val="1"/>
+      <w:numFmt w:val="bullet"/>
+      <w:lvlText w:val="o"/>
+      <w:lvlJc w:val="left"/>
+      <w:pPr>
+        <w:tabs>
+          <w:tab w:val="num" w:pos="1440"/>
+        </w:tabs>
+        <w:ind w:left="1440" w:hanging="360"/>
+      </w:pPr>
+      <w:rPr>
+        <w:rFonts w:ascii="Courier New" w:hAnsi="Courier New" w:hint="default"/>
+        <w:sz w:val="20"/>
+      </w:rPr>
+    </w:lvl>
+    <w:lvl w:ilvl="2" w:tentative="1">
+      <w:start w:val="1"/>
+      <w:numFmt w:val="bullet"/>
+      <w:lvlText w:val=""/>
+      <w:lvlJc w:val="left"/>
+      <w:pPr>
+        <w:tabs>
+          <w:tab w:val="num" w:pos="2160"/>
+        </w:tabs>
+        <w:ind w:left="2160" w:hanging="360"/>
+      </w:pPr>
+      <w:rPr>
+        <w:rFonts w:ascii="Wingdings" w:hAnsi="Wingdings" w:hint="default"/>
+        <w:sz w:val="20"/>
+      </w:rPr>
+    </w:lvl>
+    <w:lvl w:ilvl="3" w:tentative="1">
+      <w:start w:val="1"/>
+      <w:numFmt w:val="bullet"/>
+      <w:lvlText w:val=""/>
+      <w:lvlJc w:val="left"/>
+      <w:pPr>
+        <w:tabs>
+          <w:tab w:val="num" w:pos="2880"/>
+        </w:tabs>
+        <w:ind w:left="2880" w:hanging="360"/>
+      </w:pPr>
+      <w:rPr>
+        <w:rFonts w:ascii="Wingdings" w:hAnsi="Wingdings" w:hint="default"/>
+        <w:sz w:val="20"/>
+      </w:rPr>
+    </w:lvl>
+    <w:lvl w:ilvl="4" w:tentative="1">
+      <w:start w:val="1"/>
+      <w:numFmt w:val="bullet"/>
+      <w:lvlText w:val=""/>
+      <w:lvlJc w:val="left"/>
+      <w:pPr>
+        <w:tabs>
+          <w:tab w:val="num" w:pos="3600"/>
+        </w:tabs>
+        <w:ind w:left="3600" w:hanging="360"/>
+      </w:pPr>
+      <w:rPr>
+        <w:rFonts w:ascii="Wingdings" w:hAnsi="Wingdings" w:hint="default"/>
+        <w:sz w:val="20"/>
+      </w:rPr>
+    </w:lvl>
+    <w:lvl w:ilvl="5" w:tentative="1">
+      <w:start w:val="1"/>
+      <w:numFmt w:val="bullet"/>
+      <w:lvlText w:val=""/>
+      <w:lvlJc w:val="left"/>
+      <w:pPr>
+        <w:tabs>
+          <w:tab w:val="num" w:pos="4320"/>
+        </w:tabs>
+        <w:ind w:left="4320" w:hanging="360"/>
+      </w:pPr>
+      <w:rPr>
+        <w:rFonts w:ascii="Wingdings" w:hAnsi="Wingdings" w:hint="default"/>
+        <w:sz w:val="20"/>
+      </w:rPr>
+    </w:lvl>
+    <w:lvl w:ilvl="6" w:tentative="1">
+      <w:start w:val="1"/>
+      <w:numFmt w:val="bullet"/>
+      <w:lvlText w:val=""/>
+      <w:lvlJc w:val="left"/>
+      <w:pPr>
+        <w:tabs>
+          <w:tab w:val="num" w:pos="5040"/>
+        </w:tabs>
+        <w:ind w:left="5040" w:hanging="360"/>
+      </w:pPr>
+      <w:rPr>
+        <w:rFonts w:ascii="Wingdings" w:hAnsi="Wingdings" w:hint="default"/>
+        <w:sz w:val="20"/>
+      </w:rPr>
+    </w:lvl>
+    <w:lvl w:ilvl="7" w:tentative="1">
+      <w:start w:val="1"/>
+      <w:numFmt w:val="bullet"/>
+      <w:lvlText w:val=""/>
+      <w:lvlJc w:val="left"/>
+      <w:pPr>
+        <w:tabs>
+          <w:tab w:val="num" w:pos="5760"/>
+        </w:tabs>
+        <w:ind w:left="5760" w:hanging="360"/>
+      </w:pPr>
+      <w:rPr>
+        <w:rFonts w:ascii="Wingdings" w:hAnsi="Wingdings" w:hint="default"/>
+        <w:sz w:val="20"/>
+      </w:rPr>
+    </w:lvl>
+    <w:lvl w:ilvl="8" w:tentative="1">
+      <w:start w:val="1"/>
+      <w:numFmt w:val="bullet"/>
+      <w:lvlText w:val=""/>
+      <w:lvlJc w:val="left"/>
+      <w:pPr>
+        <w:tabs>
+          <w:tab w:val="num" w:pos="6480"/>
+        </w:tabs>
+        <w:ind w:left="6480" w:hanging="360"/>
+      </w:pPr>
+      <w:rPr>
+        <w:rFonts w:ascii="Wingdings" w:hAnsi="Wingdings" w:hint="default"/>
+        <w:sz w:val="20"/>
+      </w:rPr>
+    </w:lvl>
+  </w:abstractNum>
+  <w:abstractNum w:abstractNumId="1" w15:restartNumberingAfterBreak="0">
+    <w:nsid w:val="11CD1D7C"/>
+    <w:multiLevelType w:val="multilevel"/>
+    <w:tmpl w:val="213EBD78"/>
+    <w:lvl w:ilvl="0">
+      <w:start w:val="1"/>
+      <w:numFmt w:val="decimal"/>
+      <w:lvlText w:val="%1."/>
+      <w:lvlJc w:val="left"/>
+      <w:pPr>
+        <w:tabs>
+          <w:tab w:val="num" w:pos="720"/>
+        </w:tabs>
+        <w:ind w:left="720" w:hanging="360"/>
+      </w:pPr>
+      <w:rPr>
+        <w:rFonts w:asciiTheme="minorHAnsi" w:eastAsiaTheme="minorEastAsia" w:hAnsiTheme="minorHAnsi" w:cstheme="minorBidi"/>
+      </w:rPr>
+    </w:lvl>
+    <w:lvl w:ilvl="1" w:tentative="1">
+      <w:start w:val="1"/>
+      <w:numFmt w:val="decimal"/>
+      <w:lvlText w:val="%2."/>
+      <w:lvlJc w:val="left"/>
+      <w:pPr>
+        <w:tabs>
+          <w:tab w:val="num" w:pos="1440"/>
+        </w:tabs>
+        <w:ind w:left="1440" w:hanging="360"/>
+      </w:pPr>
+    </w:lvl>
+    <w:lvl w:ilvl="2" w:tentative="1">
+      <w:start w:val="1"/>
+      <w:numFmt w:val="decimal"/>
+      <w:lvlText w:val="%3."/>
+      <w:lvlJc w:val="left"/>
+      <w:pPr>
+        <w:tabs>
+          <w:tab w:val="num" w:pos="2160"/>
+        </w:tabs>
+        <w:ind w:left="2160" w:hanging="360"/>
+      </w:pPr>
+    </w:lvl>
+    <w:lvl w:ilvl="3" w:tentative="1">
+      <w:start w:val="1"/>
+      <w:numFmt w:val="decimal"/>
+      <w:lvlText w:val="%4."/>
+      <w:lvlJc w:val="left"/>
+      <w:pPr>
+        <w:tabs>
+          <w:tab w:val="num" w:pos="2880"/>
+        </w:tabs>
+        <w:ind w:left="2880" w:hanging="360"/>
+      </w:pPr>
+    </w:lvl>
+    <w:lvl w:ilvl="4" w:tentative="1">
+      <w:start w:val="1"/>
+      <w:numFmt w:val="decimal"/>
+      <w:lvlText w:val="%5."/>
+      <w:lvlJc w:val="left"/>
+      <w:pPr>
+        <w:tabs>
+          <w:tab w:val="num" w:pos="3600"/>
+        </w:tabs>
+        <w:ind w:left="3600" w:hanging="360"/>
+      </w:pPr>
+    </w:lvl>
+    <w:lvl w:ilvl="5" w:tentative="1">
+      <w:start w:val="1"/>
+      <w:numFmt w:val="decimal"/>
+      <w:lvlText w:val="%6."/>
+      <w:lvlJc w:val="left"/>
+      <w:pPr>
+        <w:tabs>
+          <w:tab w:val="num" w:pos="4320"/>
+        </w:tabs>
+        <w:ind w:left="4320" w:hanging="360"/>
+      </w:pPr>
+    </w:lvl>
+    <w:lvl w:ilvl="6" w:tentative="1">
+      <w:start w:val="1"/>
+      <w:numFmt w:val="decimal"/>
+      <w:lvlText w:val="%7."/>
+      <w:lvlJc w:val="left"/>
+      <w:pPr>
+        <w:tabs>
+          <w:tab w:val="num" w:pos="5040"/>
+        </w:tabs>
+        <w:ind w:left="5040" w:hanging="360"/>
+      </w:pPr>
+    </w:lvl>
+    <w:lvl w:ilvl="7" w:tentative="1">
+      <w:start w:val="1"/>
+      <w:numFmt w:val="decimal"/>
+      <w:lvlText w:val="%8."/>
+      <w:lvlJc w:val="left"/>
+      <w:pPr>
+        <w:tabs>
+          <w:tab w:val="num" w:pos="5760"/>
+        </w:tabs>
+        <w:ind w:left="5760" w:hanging="360"/>
+      </w:pPr>
+    </w:lvl>
+    <w:lvl w:ilvl="8" w:tentative="1">
+      <w:start w:val="1"/>
+      <w:numFmt w:val="decimal"/>
+      <w:lvlText w:val="%9."/>
+      <w:lvlJc w:val="left"/>
+      <w:pPr>
+        <w:tabs>
+          <w:tab w:val="num" w:pos="6480"/>
+        </w:tabs>
+        <w:ind w:left="6480" w:hanging="360"/>
+      </w:pPr>
+    </w:lvl>
+  </w:abstractNum>
+  <w:abstractNum w:abstractNumId="2" w15:restartNumberingAfterBreak="0">
+    <w:nsid w:val="13F26BCF"/>
+    <w:multiLevelType w:val="multilevel"/>
+    <w:tmpl w:val="4CA831EC"/>
+    <w:lvl w:ilvl="0">
+      <w:start w:val="1"/>
+      <w:numFmt w:val="bullet"/>
+      <w:lvlText w:val=""/>
+      <w:lvlJc w:val="left"/>
+      <w:pPr>
+        <w:tabs>
+          <w:tab w:val="num" w:pos="1080"/>
+        </w:tabs>
+        <w:ind w:left="1080" w:hanging="360"/>
+      </w:pPr>
+      <w:rPr>
+        <w:rFonts w:ascii="Symbol" w:hAnsi="Symbol" w:hint="default"/>
+        <w:sz w:val="20"/>
+      </w:rPr>
+    </w:lvl>
+    <w:lvl w:ilvl="1" w:tentative="1">
+      <w:start w:val="1"/>
+      <w:numFmt w:val="bullet"/>
+      <w:lvlText w:val="o"/>
+      <w:lvlJc w:val="left"/>
+      <w:pPr>
+        <w:tabs>
+          <w:tab w:val="num" w:pos="1800"/>
+        </w:tabs>
+        <w:ind w:left="1800" w:hanging="360"/>
+      </w:pPr>
+      <w:rPr>
+        <w:rFonts w:ascii="Courier New" w:hAnsi="Courier New" w:hint="default"/>
+        <w:sz w:val="20"/>
+      </w:rPr>
+    </w:lvl>
+    <w:lvl w:ilvl="2" w:tentative="1">
+      <w:start w:val="1"/>
+      <w:numFmt w:val="bullet"/>
+      <w:lvlText w:val=""/>
+      <w:lvlJc w:val="left"/>
+      <w:pPr>
+        <w:tabs>
+          <w:tab w:val="num" w:pos="2520"/>
+        </w:tabs>
+        <w:ind w:left="2520" w:hanging="360"/>
+      </w:pPr>
+      <w:rPr>
+        <w:rFonts w:ascii="Wingdings" w:hAnsi="Wingdings" w:hint="default"/>
+        <w:sz w:val="20"/>
+      </w:rPr>
+    </w:lvl>
+    <w:lvl w:ilvl="3" w:tentative="1">
+      <w:start w:val="1"/>
+      <w:numFmt w:val="bullet"/>
+      <w:lvlText w:val=""/>
+      <w:lvlJc w:val="left"/>
+      <w:pPr>
+        <w:tabs>
+          <w:tab w:val="num" w:pos="3240"/>
+        </w:tabs>
+        <w:ind w:left="3240" w:hanging="360"/>
+      </w:pPr>
+      <w:rPr>
+        <w:rFonts w:ascii="Wingdings" w:hAnsi="Wingdings" w:hint="default"/>
+        <w:sz w:val="20"/>
+      </w:rPr>
+    </w:lvl>
+    <w:lvl w:ilvl="4" w:tentative="1">
+      <w:start w:val="1"/>
+      <w:numFmt w:val="bullet"/>
+      <w:lvlText w:val=""/>
+      <w:lvlJc w:val="left"/>
+      <w:pPr>
+        <w:tabs>
+          <w:tab w:val="num" w:pos="3960"/>
+        </w:tabs>
+        <w:ind w:left="3960" w:hanging="360"/>
+      </w:pPr>
+      <w:rPr>
+        <w:rFonts w:ascii="Wingdings" w:hAnsi="Wingdings" w:hint="default"/>
+        <w:sz w:val="20"/>
+      </w:rPr>
+    </w:lvl>
+    <w:lvl w:ilvl="5" w:tentative="1">
+      <w:start w:val="1"/>
+      <w:numFmt w:val="bullet"/>
+      <w:lvlText w:val=""/>
+      <w:lvlJc w:val="left"/>
+      <w:pPr>
+        <w:tabs>
+          <w:tab w:val="num" w:pos="4680"/>
+        </w:tabs>
+        <w:ind w:left="4680" w:hanging="360"/>
+      </w:pPr>
+      <w:rPr>
+        <w:rFonts w:ascii="Wingdings" w:hAnsi="Wingdings" w:hint="default"/>
+        <w:sz w:val="20"/>
+      </w:rPr>
+    </w:lvl>
+    <w:lvl w:ilvl="6" w:tentative="1">
+      <w:start w:val="1"/>
+      <w:numFmt w:val="bullet"/>
+      <w:lvlText w:val=""/>
+      <w:lvlJc w:val="left"/>
+      <w:pPr>
+        <w:tabs>
+          <w:tab w:val="num" w:pos="5400"/>
+        </w:tabs>
+        <w:ind w:left="5400" w:hanging="360"/>
+      </w:pPr>
+      <w:rPr>
+        <w:rFonts w:ascii="Wingdings" w:hAnsi="Wingdings" w:hint="default"/>
+        <w:sz w:val="20"/>
+      </w:rPr>
+    </w:lvl>
+    <w:lvl w:ilvl="7" w:tentative="1">
+      <w:start w:val="1"/>
+      <w:numFmt w:val="bullet"/>
+      <w:lvlText w:val=""/>
+      <w:lvlJc w:val="left"/>
+      <w:pPr>
+        <w:tabs>
+          <w:tab w:val="num" w:pos="6120"/>
+        </w:tabs>
+        <w:ind w:left="6120" w:hanging="360"/>
+      </w:pPr>
+      <w:rPr>
+        <w:rFonts w:ascii="Wingdings" w:hAnsi="Wingdings" w:hint="default"/>
+        <w:sz w:val="20"/>
+      </w:rPr>
+    </w:lvl>
+    <w:lvl w:ilvl="8" w:tentative="1">
+      <w:start w:val="1"/>
+      <w:numFmt w:val="bullet"/>
+      <w:lvlText w:val=""/>
+      <w:lvlJc w:val="left"/>
+      <w:pPr>
+        <w:tabs>
+          <w:tab w:val="num" w:pos="6840"/>
+        </w:tabs>
+        <w:ind w:left="6840" w:hanging="360"/>
+      </w:pPr>
+      <w:rPr>
+        <w:rFonts w:ascii="Wingdings" w:hAnsi="Wingdings" w:hint="default"/>
+        <w:sz w:val="20"/>
+      </w:rPr>
+    </w:lvl>
+  </w:abstractNum>
+  <w:abstractNum w:abstractNumId="3" w15:restartNumberingAfterBreak="0">
     <w:nsid w:val="199B0822"/>
     <w:multiLevelType w:val="hybridMultilevel"/>
     <w:tmpl w:val="5B9A927C"/>
@@ -1774,7 +2745,132 @@
       </w:rPr>
     </w:lvl>
   </w:abstractNum>
+  <w:abstractNum w:abstractNumId="4" w15:restartNumberingAfterBreak="0">
+    <w:nsid w:val="7ED57E26"/>
+    <w:multiLevelType w:val="multilevel"/>
+    <w:tmpl w:val="AAC6DA50"/>
+    <w:lvl w:ilvl="0">
+      <w:start w:val="4"/>
+      <w:numFmt w:val="decimal"/>
+      <w:lvlText w:val="%1."/>
+      <w:lvlJc w:val="left"/>
+      <w:pPr>
+        <w:tabs>
+          <w:tab w:val="num" w:pos="720"/>
+        </w:tabs>
+        <w:ind w:left="720" w:hanging="360"/>
+      </w:pPr>
+    </w:lvl>
+    <w:lvl w:ilvl="1" w:tentative="1">
+      <w:start w:val="1"/>
+      <w:numFmt w:val="decimal"/>
+      <w:lvlText w:val="%2."/>
+      <w:lvlJc w:val="left"/>
+      <w:pPr>
+        <w:tabs>
+          <w:tab w:val="num" w:pos="1440"/>
+        </w:tabs>
+        <w:ind w:left="1440" w:hanging="360"/>
+      </w:pPr>
+    </w:lvl>
+    <w:lvl w:ilvl="2" w:tentative="1">
+      <w:start w:val="1"/>
+      <w:numFmt w:val="decimal"/>
+      <w:lvlText w:val="%3."/>
+      <w:lvlJc w:val="left"/>
+      <w:pPr>
+        <w:tabs>
+          <w:tab w:val="num" w:pos="2160"/>
+        </w:tabs>
+        <w:ind w:left="2160" w:hanging="360"/>
+      </w:pPr>
+    </w:lvl>
+    <w:lvl w:ilvl="3" w:tentative="1">
+      <w:start w:val="1"/>
+      <w:numFmt w:val="decimal"/>
+      <w:lvlText w:val="%4."/>
+      <w:lvlJc w:val="left"/>
+      <w:pPr>
+        <w:tabs>
+          <w:tab w:val="num" w:pos="2880"/>
+        </w:tabs>
+        <w:ind w:left="2880" w:hanging="360"/>
+      </w:pPr>
+    </w:lvl>
+    <w:lvl w:ilvl="4" w:tentative="1">
+      <w:start w:val="1"/>
+      <w:numFmt w:val="decimal"/>
+      <w:lvlText w:val="%5."/>
+      <w:lvlJc w:val="left"/>
+      <w:pPr>
+        <w:tabs>
+          <w:tab w:val="num" w:pos="3600"/>
+        </w:tabs>
+        <w:ind w:left="3600" w:hanging="360"/>
+      </w:pPr>
+    </w:lvl>
+    <w:lvl w:ilvl="5" w:tentative="1">
+      <w:start w:val="1"/>
+      <w:numFmt w:val="decimal"/>
+      <w:lvlText w:val="%6."/>
+      <w:lvlJc w:val="left"/>
+      <w:pPr>
+        <w:tabs>
+          <w:tab w:val="num" w:pos="4320"/>
+        </w:tabs>
+        <w:ind w:left="4320" w:hanging="360"/>
+      </w:pPr>
+    </w:lvl>
+    <w:lvl w:ilvl="6" w:tentative="1">
+      <w:start w:val="1"/>
+      <w:numFmt w:val="decimal"/>
+      <w:lvlText w:val="%7."/>
+      <w:lvlJc w:val="left"/>
+      <w:pPr>
+        <w:tabs>
+          <w:tab w:val="num" w:pos="5040"/>
+        </w:tabs>
+        <w:ind w:left="5040" w:hanging="360"/>
+      </w:pPr>
+    </w:lvl>
+    <w:lvl w:ilvl="7" w:tentative="1">
+      <w:start w:val="1"/>
+      <w:numFmt w:val="decimal"/>
+      <w:lvlText w:val="%8."/>
+      <w:lvlJc w:val="left"/>
+      <w:pPr>
+        <w:tabs>
+          <w:tab w:val="num" w:pos="5760"/>
+        </w:tabs>
+        <w:ind w:left="5760" w:hanging="360"/>
+      </w:pPr>
+    </w:lvl>
+    <w:lvl w:ilvl="8" w:tentative="1">
+      <w:start w:val="1"/>
+      <w:numFmt w:val="decimal"/>
+      <w:lvlText w:val="%9."/>
+      <w:lvlJc w:val="left"/>
+      <w:pPr>
+        <w:tabs>
+          <w:tab w:val="num" w:pos="6480"/>
+        </w:tabs>
+        <w:ind w:left="6480" w:hanging="360"/>
+      </w:pPr>
+    </w:lvl>
+  </w:abstractNum>
   <w:num w:numId="1" w16cid:durableId="347877722">
+    <w:abstractNumId w:val="3"/>
+  </w:num>
+  <w:num w:numId="2" w16cid:durableId="1589074416">
+    <w:abstractNumId w:val="1"/>
+  </w:num>
+  <w:num w:numId="3" w16cid:durableId="1126432860">
+    <w:abstractNumId w:val="2"/>
+  </w:num>
+  <w:num w:numId="4" w16cid:durableId="1646399702">
+    <w:abstractNumId w:val="4"/>
+  </w:num>
+  <w:num w:numId="5" w16cid:durableId="100927114">
     <w:abstractNumId w:val="0"/>
   </w:num>
 </w:numbering>
@@ -2210,7 +3306,6 @@
     <w:next w:val="Normal"/>
     <w:link w:val="Heading2Char"/>
     <w:uiPriority w:val="9"/>
-    <w:semiHidden/>
     <w:unhideWhenUsed/>
     <w:qFormat/>
     <w:rsid w:val="00DC68BE"/>
@@ -2389,7 +3484,6 @@
   <w:style w:type="character" w:default="1" w:styleId="DefaultParagraphFont">
     <w:name w:val="Default Paragraph Font"/>
     <w:uiPriority w:val="1"/>
-    <w:semiHidden/>
     <w:unhideWhenUsed/>
   </w:style>
   <w:style w:type="table" w:default="1" w:styleId="TableNormal">
@@ -2431,7 +3525,6 @@
     <w:basedOn w:val="DefaultParagraphFont"/>
     <w:link w:val="Heading2"/>
     <w:uiPriority w:val="9"/>
-    <w:semiHidden/>
     <w:rsid w:val="00DC68BE"/>
     <w:rPr>
       <w:rFonts w:asciiTheme="majorHAnsi" w:eastAsiaTheme="majorEastAsia" w:hAnsiTheme="majorHAnsi" w:cstheme="majorBidi"/>

</xml_diff>